<commit_message>
Polish final report consistency
</commit_message>
<xml_diff>
--- a/report/ML_household_power_report.docx
+++ b/report/ML_household_power_report.docx
@@ -42,7 +42,7 @@
           <w:color w:val="1F4E79"/>
           <w:sz w:val="29"/>
         </w:rPr>
-        <w:t xml:space="preserve">LSTM、Transformer 与验证集校准 DMSAFormer 的比较研究</w:t>
+        <w:t xml:space="preserve">LSTM、Transformer、HybridTCNTransformer 与验证集校准 DMSAFormer 的比较研究</w:t>
       </w:r>
     </w:p>
     <w:p>
@@ -203,7 +203,7 @@
                 <w:rFonts w:ascii="Microsoft YaHei" w:hAnsi="Microsoft YaHei" w:eastAsia="Microsoft YaHei"/>
                 <w:sz w:val="18"/>
               </w:rPr>
-              <w:t xml:space="preserve">153907.015</w:t>
+              <w:t xml:space="preserve">153907.02</w:t>
             </w:r>
           </w:p>
         </w:tc>
@@ -218,7 +218,7 @@
                 <w:rFonts w:ascii="Microsoft YaHei" w:hAnsi="Microsoft YaHei" w:eastAsia="Microsoft YaHei"/>
                 <w:sz w:val="18"/>
               </w:rPr>
-              <w:t xml:space="preserve">301.130</w:t>
+              <w:t xml:space="preserve">301.13</w:t>
             </w:r>
           </w:p>
         </w:tc>
@@ -269,7 +269,7 @@
                 <w:rFonts w:ascii="Microsoft YaHei" w:hAnsi="Microsoft YaHei" w:eastAsia="Microsoft YaHei"/>
                 <w:sz w:val="18"/>
               </w:rPr>
-              <w:t xml:space="preserve">272821.277</w:t>
+              <w:t xml:space="preserve">272821.28</w:t>
             </w:r>
           </w:p>
         </w:tc>
@@ -287,7 +287,7 @@
                 <w:rFonts w:ascii="Microsoft YaHei" w:hAnsi="Microsoft YaHei" w:eastAsia="Microsoft YaHei"/>
                 <w:sz w:val="18"/>
               </w:rPr>
-              <w:t xml:space="preserve">409.585</w:t>
+              <w:t xml:space="preserve">409.59</w:t>
             </w:r>
           </w:p>
         </w:tc>
@@ -322,7 +322,7 @@
           <w:color w:val="444444"/>
           <w:sz w:val="20"/>
         </w:rPr>
-        <w:t xml:space="preserve">实验协议：全部模型均按 90 天输入分别预测未来 90 天与 365 天，每个设置运行 5 个随机种子；DMSAFormer 的专家选择与 affine 校准只使用验证集，不使用测试集标签。</w:t>
+        <w:t xml:space="preserve">实验协议：四种模型均按 90 天输入分别预测未来 90 天与 365 天，每个设置运行 5 个随机种子，共 40 次训练与评估；DMSAFormer 的专家选择与 affine 校准只使用验证集，不使用测试集标签。</w:t>
       </w:r>
     </w:p>
     <w:p>
@@ -553,7 +553,7 @@
           <w:color w:val="666666"/>
           <w:sz w:val="20"/>
         </w:rPr>
-        <w:t xml:space="preserve">3.3 改进模型 DMSAFormer</w:t>
+        <w:t xml:space="preserve">3.3 HybridTCNTransformer 改进基线</w:t>
       </w:r>
     </w:p>
     <w:p>
@@ -568,7 +568,22 @@
           <w:color w:val="666666"/>
           <w:sz w:val="20"/>
         </w:rPr>
-        <w:t xml:space="preserve">3.4 改进过程与失败诊断</w:t>
+        <w:t xml:space="preserve">3.4 改进模型 DMSAFormer</w:t>
+      </w:r>
+    </w:p>
+    <w:p>
+      <w:pPr>
+        <w:spacing w:after="40" w:line="276" w:lineRule="auto"/>
+        <w:ind w:left="420"/>
+      </w:pPr>
+      <w:r>
+        <w:rPr>
+          <w:rFonts w:ascii="Microsoft YaHei" w:hAnsi="Microsoft YaHei" w:eastAsia="Microsoft YaHei"/>
+          <w:b w:val="false"/>
+          <w:color w:val="666666"/>
+          <w:sz w:val="20"/>
+        </w:rPr>
+        <w:t xml:space="preserve">3.5 改进过程与失败诊断</w:t>
       </w:r>
     </w:p>
     <w:p>
@@ -1640,7 +1655,7 @@
           <w:rFonts w:ascii="Microsoft YaHei" w:hAnsi="Microsoft YaHei" w:eastAsia="Microsoft YaHei"/>
           <w:sz w:val="21"/>
         </w:rPr>
-        <w:t xml:space="preserve">每个模型、每个预测长度运行 seeds 2026、2027、2028、2029、2030 共 5 轮。</w:t>
+        <w:t xml:space="preserve">四个模型、两个预测长度、每个设置运行 seeds 2026、2027、2028、2029、2030 共 40 次训练与评估。</w:t>
       </w:r>
     </w:p>
     <w:p>
@@ -1703,7 +1718,7 @@
                     <pic:cNvPicPr/>
                   </pic:nvPicPr>
                   <pic:blipFill>
-                    <a:blip r:embed="R179ef37cd6d847ee" cstate="print"/>
+                    <a:blip r:embed="Rb6a8d1b3c3bc4094" cstate="print"/>
                     <a:stretch>
                       <a:fillRect/>
                     </a:stretch>
@@ -1761,6 +1776,295 @@
         <w:t xml:space="preserve">3. 模型方法</w:t>
       </w:r>
     </w:p>
+    <w:tbl>
+      <w:tblPr>
+        <w:tblStyle w:val="light1"/>
+        <w:tblW w:w="5000" w:type="pct"/>
+        <w:tblBorders>
+          <w:top w:val="single" w:sz="4"/>
+          <w:left w:val="single" w:sz="4"/>
+          <w:bottom w:val="single" w:sz="4"/>
+          <w:right w:val="single" w:sz="4"/>
+          <w:insideH w:val="single" w:sz="4"/>
+          <w:insideV w:val="single" w:sz="4"/>
+        </w:tblBorders>
+        <w:tblLayout w:type="fixed"/>
+        <w:tblLook w:val="04A0"/>
+      </w:tblPr>
+      <w:tblGrid>
+        <w:gridCol w:w="2200"/>
+        <w:gridCol w:w="6800"/>
+        <w:gridCol w:w="3000"/>
+      </w:tblGrid>
+      <w:tr>
+        <w:trPr>
+          <w:tblHeader/>
+        </w:trPr>
+        <w:tc>
+          <w:tcPr>
+            <w:shd w:val="clear" w:fill="1F4E79"/>
+            <w:vAlign w:val="center"/>
+          </w:tcPr>
+          <w:p>
+            <w:pPr>
+              <w:pBdr>
+                <w:bottom w:val="single" w:color="17365D" w:sz="8" w:space="0"/>
+              </w:pBdr>
+              <w:jc w:val="center"/>
+            </w:pPr>
+            <w:r>
+              <w:rPr>
+                <w:rFonts w:ascii="Microsoft YaHei" w:hAnsi="Microsoft YaHei" w:eastAsia="Microsoft YaHei"/>
+                <w:b/>
+                <w:color w:val="FFFFFF"/>
+                <w:sz w:val="18"/>
+              </w:rPr>
+              <w:t xml:space="preserve">模型</w:t>
+            </w:r>
+          </w:p>
+        </w:tc>
+        <w:tc>
+          <w:tcPr>
+            <w:shd w:val="clear" w:fill="1F4E79"/>
+            <w:vAlign w:val="center"/>
+          </w:tcPr>
+          <w:p>
+            <w:pPr>
+              <w:pBdr>
+                <w:bottom w:val="single" w:color="17365D" w:sz="8" w:space="0"/>
+              </w:pBdr>
+              <w:jc w:val="center"/>
+            </w:pPr>
+            <w:r>
+              <w:rPr>
+                <w:rFonts w:ascii="Microsoft YaHei" w:hAnsi="Microsoft YaHei" w:eastAsia="Microsoft YaHei"/>
+                <w:b/>
+                <w:color w:val="FFFFFF"/>
+                <w:sz w:val="18"/>
+              </w:rPr>
+              <w:t xml:space="preserve">关键结构与超参数</w:t>
+            </w:r>
+          </w:p>
+        </w:tc>
+        <w:tc>
+          <w:tcPr>
+            <w:shd w:val="clear" w:fill="1F4E79"/>
+            <w:vAlign w:val="center"/>
+          </w:tcPr>
+          <w:p>
+            <w:pPr>
+              <w:pBdr>
+                <w:bottom w:val="single" w:color="17365D" w:sz="8" w:space="0"/>
+              </w:pBdr>
+              <w:jc w:val="center"/>
+            </w:pPr>
+            <w:r>
+              <w:rPr>
+                <w:rFonts w:ascii="Microsoft YaHei" w:hAnsi="Microsoft YaHei" w:eastAsia="Microsoft YaHei"/>
+                <w:b/>
+                <w:color w:val="FFFFFF"/>
+                <w:sz w:val="18"/>
+              </w:rPr>
+              <w:t xml:space="preserve">输出方式</w:t>
+            </w:r>
+          </w:p>
+        </w:tc>
+      </w:tr>
+      <w:tr>
+        <w:tc>
+          <w:p>
+            <w:pPr>
+              <w:spacing w:after="20" w:line="276" w:lineRule="auto"/>
+            </w:pPr>
+            <w:r>
+              <w:rPr>
+                <w:rFonts w:ascii="Microsoft YaHei" w:hAnsi="Microsoft YaHei" w:eastAsia="Microsoft YaHei"/>
+                <w:sz w:val="18"/>
+              </w:rPr>
+              <w:t xml:space="preserve">LSTM</w:t>
+            </w:r>
+          </w:p>
+        </w:tc>
+        <w:tc>
+          <w:p>
+            <w:pPr>
+              <w:spacing w:after="20" w:line="276" w:lineRule="auto"/>
+            </w:pPr>
+            <w:r>
+              <w:rPr>
+                <w:rFonts w:ascii="Microsoft YaHei" w:hAnsi="Microsoft YaHei" w:eastAsia="Microsoft YaHei"/>
+                <w:sz w:val="18"/>
+              </w:rPr>
+              <w:t xml:space="preserve">2 层 LSTM，hidden size=64，dropout=0.1，LayerNorm+MLP head</w:t>
+            </w:r>
+          </w:p>
+        </w:tc>
+        <w:tc>
+          <w:p>
+            <w:pPr>
+              <w:spacing w:after="20" w:line="276" w:lineRule="auto"/>
+            </w:pPr>
+            <w:r>
+              <w:rPr>
+                <w:rFonts w:ascii="Microsoft YaHei" w:hAnsi="Microsoft YaHei" w:eastAsia="Microsoft YaHei"/>
+                <w:sz w:val="18"/>
+              </w:rPr>
+              <w:t xml:space="preserve">直接输出 90/365 天</w:t>
+            </w:r>
+          </w:p>
+        </w:tc>
+      </w:tr>
+      <w:tr>
+        <w:tc>
+          <w:tcPr>
+            <w:shd w:val="clear" w:fill="F4F8FB"/>
+          </w:tcPr>
+          <w:p>
+            <w:pPr>
+              <w:spacing w:after="20" w:line="276" w:lineRule="auto"/>
+            </w:pPr>
+            <w:r>
+              <w:rPr>
+                <w:rFonts w:ascii="Microsoft YaHei" w:hAnsi="Microsoft YaHei" w:eastAsia="Microsoft YaHei"/>
+                <w:sz w:val="18"/>
+              </w:rPr>
+              <w:t xml:space="preserve">Transformer</w:t>
+            </w:r>
+          </w:p>
+        </w:tc>
+        <w:tc>
+          <w:tcPr>
+            <w:shd w:val="clear" w:fill="F4F8FB"/>
+          </w:tcPr>
+          <w:p>
+            <w:pPr>
+              <w:spacing w:after="20" w:line="276" w:lineRule="auto"/>
+            </w:pPr>
+            <w:r>
+              <w:rPr>
+                <w:rFonts w:ascii="Microsoft YaHei" w:hAnsi="Microsoft YaHei" w:eastAsia="Microsoft YaHei"/>
+                <w:sz w:val="18"/>
+              </w:rPr>
+              <w:t xml:space="preserve">d_model=64，4 heads，2 层 encoder，FFN=128，dropout=0.1</w:t>
+            </w:r>
+          </w:p>
+        </w:tc>
+        <w:tc>
+          <w:tcPr>
+            <w:shd w:val="clear" w:fill="F4F8FB"/>
+          </w:tcPr>
+          <w:p>
+            <w:pPr>
+              <w:spacing w:after="20" w:line="276" w:lineRule="auto"/>
+            </w:pPr>
+            <w:r>
+              <w:rPr>
+                <w:rFonts w:ascii="Microsoft YaHei" w:hAnsi="Microsoft YaHei" w:eastAsia="Microsoft YaHei"/>
+                <w:sz w:val="18"/>
+              </w:rPr>
+              <w:t xml:space="preserve">mean pooling 后直接多步预测</w:t>
+            </w:r>
+          </w:p>
+        </w:tc>
+      </w:tr>
+      <w:tr>
+        <w:tc>
+          <w:p>
+            <w:pPr>
+              <w:spacing w:after="20" w:line="276" w:lineRule="auto"/>
+            </w:pPr>
+            <w:r>
+              <w:rPr>
+                <w:rFonts w:ascii="Microsoft YaHei" w:hAnsi="Microsoft YaHei" w:eastAsia="Microsoft YaHei"/>
+                <w:sz w:val="18"/>
+              </w:rPr>
+              <w:t xml:space="preserve">HybridTCNTransformer</w:t>
+            </w:r>
+          </w:p>
+        </w:tc>
+        <w:tc>
+          <w:p>
+            <w:pPr>
+              <w:spacing w:after="20" w:line="276" w:lineRule="auto"/>
+            </w:pPr>
+            <w:r>
+              <w:rPr>
+                <w:rFonts w:ascii="Microsoft YaHei" w:hAnsi="Microsoft YaHei" w:eastAsia="Microsoft YaHei"/>
+                <w:sz w:val="18"/>
+              </w:rPr>
+              <w:t xml:space="preserve">1x1 Conv 投影，3 个 kernel=3、dilation=1/2/4 的 TCN 残差块，2 层 TransformerEncoder</w:t>
+            </w:r>
+          </w:p>
+        </w:tc>
+        <w:tc>
+          <w:p>
+            <w:pPr>
+              <w:spacing w:after="20" w:line="276" w:lineRule="auto"/>
+            </w:pPr>
+            <w:r>
+              <w:rPr>
+                <w:rFonts w:ascii="Microsoft YaHei" w:hAnsi="Microsoft YaHei" w:eastAsia="Microsoft YaHei"/>
+                <w:sz w:val="18"/>
+              </w:rPr>
+              <w:t xml:space="preserve">局部特征+全局依赖后直接输出</w:t>
+            </w:r>
+          </w:p>
+        </w:tc>
+      </w:tr>
+      <w:tr>
+        <w:tc>
+          <w:tcPr>
+            <w:shd w:val="clear" w:fill="F4F8FB"/>
+          </w:tcPr>
+          <w:p>
+            <w:pPr>
+              <w:spacing w:after="20" w:line="276" w:lineRule="auto"/>
+            </w:pPr>
+            <w:r>
+              <w:rPr>
+                <w:rFonts w:ascii="Microsoft YaHei" w:hAnsi="Microsoft YaHei" w:eastAsia="Microsoft YaHei"/>
+                <w:sz w:val="18"/>
+              </w:rPr>
+              <w:t xml:space="preserve">DMSAFormer</w:t>
+            </w:r>
+          </w:p>
+        </w:tc>
+        <w:tc>
+          <w:tcPr>
+            <w:shd w:val="clear" w:fill="F4F8FB"/>
+          </w:tcPr>
+          <w:p>
+            <w:pPr>
+              <w:spacing w:after="20" w:line="276" w:lineRule="auto"/>
+            </w:pPr>
+            <w:r>
+              <w:rPr>
+                <w:rFonts w:ascii="Microsoft YaHei" w:hAnsi="Microsoft YaHei" w:eastAsia="Microsoft YaHei"/>
+                <w:sz w:val="18"/>
+              </w:rPr>
+              <w:t xml:space="preserve">分解、变量注意力、3/7/30 多尺度卷积、Hybrid/LSTM 专家、validation 校准</w:t>
+            </w:r>
+          </w:p>
+        </w:tc>
+        <w:tc>
+          <w:tcPr>
+            <w:shd w:val="clear" w:fill="F4F8FB"/>
+          </w:tcPr>
+          <w:p>
+            <w:pPr>
+              <w:spacing w:after="20" w:line="276" w:lineRule="auto"/>
+            </w:pPr>
+            <w:r>
+              <w:rPr>
+                <w:rFonts w:ascii="Microsoft YaHei" w:hAnsi="Microsoft YaHei" w:eastAsia="Microsoft YaHei"/>
+                <w:sz w:val="18"/>
+              </w:rPr>
+              <w:t xml:space="preserve">验证集专家选择或 affine 校准后输出</w:t>
+            </w:r>
+          </w:p>
+        </w:tc>
+      </w:tr>
+    </w:tbl>
     <w:p>
       <w:pPr>
         <w:pStyle w:val="Heading2"/>
@@ -1921,7 +2225,7 @@
           <w:color w:val="1F4E79"/>
           <w:sz w:val="28"/>
         </w:rPr>
-        <w:t xml:space="preserve">3.3 改进模型 DMSAFormer</w:t>
+        <w:t xml:space="preserve">3.3 HybridTCNTransformer 改进基线</w:t>
       </w:r>
     </w:p>
     <w:p>
@@ -1935,7 +2239,81 @@
           <w:rFonts w:ascii="Microsoft YaHei" w:hAnsi="Microsoft YaHei" w:eastAsia="Microsoft YaHei"/>
           <w:sz w:val="22"/>
         </w:rPr>
-        <w:t xml:space="preserve">第三个模型采用 DMSAFormer，即 Decomposition-based Multi-Scale Attention Transformer。初始版本包含移动平均分解、变量注意力、多尺度卷积残差分支和 Transformer 编码器。正式实验发现，单纯注意力和残差分支在 365 天任务上不够稳定，主要原因是长期任务训练窗口只有 78 个，复杂模型容易早停并出现高方差。</w:t>
+        <w:t xml:space="preserve">HybridTCNTransformer 先通过 1x1 Conv 将 19 维日级输入投影到 64 通道，再使用三个 TCN 残差块提取局部时间模式。残差块 kernel size 为 3，dilation 分别为 1、2、4，并通过 BatchNorm 和残差连接稳定训练。随后模型加入位置编码并使用 TransformerEncoder 建模更长范围的依赖，最后通过平均池化和 MLP 直接输出未来曲线。</w:t>
+      </w:r>
+    </w:p>
+    <w:p>
+      <w:pPr>
+        <w:shd w:val="clear" w:fill="F3F6FA"/>
+        <w:spacing w:after="60"/>
+        <w:ind w:left="360"/>
+      </w:pPr>
+      <w:r>
+        <w:rPr>
+          <w:rFonts w:ascii="Consolas" w:hAnsi="Consolas" w:eastAsia="Consolas"/>
+          <w:color w:val="333333"/>
+          <w:sz w:val="18"/>
+        </w:rPr>
+        <w:t xml:space="preserve">Z = Conv1dProjection(X)</w:t>
+      </w:r>
+    </w:p>
+    <w:p>
+      <w:pPr>
+        <w:shd w:val="clear" w:fill="F3F6FA"/>
+        <w:spacing w:after="60"/>
+        <w:ind w:left="360"/>
+      </w:pPr>
+      <w:r>
+        <w:rPr>
+          <w:rFonts w:ascii="Consolas" w:hAnsi="Consolas" w:eastAsia="Consolas"/>
+          <w:color w:val="333333"/>
+          <w:sz w:val="18"/>
+        </w:rPr>
+        <w:t xml:space="preserve">Z = TCNResidualBlocks(Z, dilation=[1,2,4])</w:t>
+      </w:r>
+    </w:p>
+    <w:p>
+      <w:pPr>
+        <w:shd w:val="clear" w:fill="F3F6FA"/>
+        <w:spacing w:after="60"/>
+        <w:ind w:left="360"/>
+      </w:pPr>
+      <w:r>
+        <w:rPr>
+          <w:rFonts w:ascii="Consolas" w:hAnsi="Consolas" w:eastAsia="Consolas"/>
+          <w:color w:val="333333"/>
+          <w:sz w:val="18"/>
+        </w:rPr>
+        <w:t xml:space="preserve">y_hat = MLP(MeanPool(TransformerEncoder(PositionalEncoding(Z))))</w:t>
+      </w:r>
+    </w:p>
+    <w:p>
+      <w:pPr>
+        <w:pStyle w:val="Heading2"/>
+        <w:keepNext/>
+        <w:spacing w:before="240" w:after="100"/>
+      </w:pPr>
+      <w:r>
+        <w:rPr>
+          <w:b/>
+          <w:color w:val="1F4E79"/>
+          <w:sz w:val="28"/>
+        </w:rPr>
+        <w:t xml:space="preserve">3.4 改进模型 DMSAFormer</w:t>
+      </w:r>
+    </w:p>
+    <w:p>
+      <w:pPr>
+        <w:spacing w:after="120" w:line="324" w:lineRule="auto"/>
+        <w:ind w:firstLine="440"/>
+        <w:jc w:val="both"/>
+      </w:pPr>
+      <w:r>
+        <w:rPr>
+          <w:rFonts w:ascii="Microsoft YaHei" w:hAnsi="Microsoft YaHei" w:eastAsia="Microsoft YaHei"/>
+          <w:sz w:val="22"/>
+        </w:rPr>
+        <w:t xml:space="preserve">最终改进模型采用 DMSAFormer，即 Decomposition-based Multi-Scale Attention Transformer。初始版本包含移动平均分解、变量注意力、多尺度卷积残差分支和 Transformer 编码器。正式实验发现，单纯注意力和残差分支在 365 天任务上不够稳定，主要原因是长期任务训练窗口只有 78 个，复杂模型容易早停并出现高方差。</w:t>
       </w:r>
     </w:p>
     <w:p>
@@ -2215,7 +2593,7 @@
           <w:color w:val="1F4E79"/>
           <w:sz w:val="28"/>
         </w:rPr>
-        <w:t xml:space="preserve">3.4 改进过程与失败诊断</w:t>
+        <w:t xml:space="preserve">3.5 改进过程与失败诊断</w:t>
       </w:r>
     </w:p>
     <w:p>
@@ -2229,7 +2607,7 @@
           <w:rFonts w:ascii="Microsoft YaHei" w:hAnsi="Microsoft YaHei" w:eastAsia="Microsoft YaHei"/>
           <w:sz w:val="22"/>
         </w:rPr>
-        <w:t xml:space="preserve">第三模型并非一次成型。初版 DMSAFormer 在两个任务上均弱于已有模型：90 天任务比最强 Hybrid 高约 30.46% MSE，365 天任务比最强 LSTM 高约 26.05% MSE。训练日志显示长期任务经常在较早 epoch 停止，说明 attention-heavy 结构在只有 78 个长期训练窗口时没有充分泛化。</w:t>
+        <w:t xml:space="preserve">DMSAFormer 并非一次成型。初版 DMSAFormer 在两个任务上均弱于已有模型：90 天任务比最强 Hybrid 高约 30.46% MSE，365 天任务比最强 LSTM 高约 26.05% MSE。训练日志显示长期任务经常在较早 epoch 停止，说明 attention-heavy 结构在只有 78 个长期训练窗口时没有充分泛化。</w:t>
       </w:r>
     </w:p>
     <w:p>
@@ -2510,7 +2888,7 @@
                     <pic:cNvPicPr/>
                   </pic:nvPicPr>
                   <pic:blipFill>
-                    <a:blip r:embed="R135486a53a76434f" cstate="print"/>
+                    <a:blip r:embed="Reb94ce941fae4b59" cstate="print"/>
                     <a:stretch>
                       <a:fillRect/>
                     </a:stretch>
@@ -2594,7 +2972,22 @@
           <w:rFonts w:ascii="Microsoft YaHei" w:hAnsi="Microsoft YaHei" w:eastAsia="Microsoft YaHei"/>
           <w:sz w:val="22"/>
         </w:rPr>
-        <w:t xml:space="preserve">最终结果来自 90 天和 365 天两个任务的 5 个随机种子实验。下表列出各模型在测试集原始尺度上的 MSE 与 MAE 均值、标准差和运行次数。DMSAFormer 在两个预测长度上均取得最小 MSE 和 MAE，满足“第三个改进模型在最终对比中最好”的目标。</w:t>
+        <w:t xml:space="preserve">最终结果来自 90 天和 365 天两个任务的 5 个随机种子实验，共 40 次训练与评估。下表按预测长度拆分，列出各模型在测试集原始尺度上的 MSE 与 MAE 均值、标准差和运行次数。DMSAFormer 在两个预测长度上均取得最小 MSE 和 MAE；若只比较非 DMSAFormer baseline，90 天任务 HybridTCNTransformer 最好，365 天任务 LSTM 最好。</w:t>
+      </w:r>
+    </w:p>
+    <w:p>
+      <w:pPr>
+        <w:pStyle w:val="Heading3"/>
+        <w:keepNext/>
+        <w:spacing w:before="160" w:after="80"/>
+      </w:pPr>
+      <w:r>
+        <w:rPr>
+          <w:b/>
+          <w:color w:val="17365D"/>
+          <w:sz w:val="24"/>
+        </w:rPr>
+        <w:t xml:space="preserve">90 天预测结果</w:t>
       </w:r>
     </w:p>
     <w:tbl>
@@ -2613,13 +3006,10 @@
         <w:tblLook w:val="04A0"/>
       </w:tblPr>
       <w:tblGrid>
-        <w:gridCol w:w="2200"/>
-        <w:gridCol w:w="1800"/>
-        <w:gridCol w:w="2200"/>
-        <w:gridCol w:w="2200"/>
-        <w:gridCol w:w="2200"/>
-        <w:gridCol w:w="2200"/>
-        <w:gridCol w:w="1000"/>
+        <w:gridCol w:w="3600"/>
+        <w:gridCol w:w="3600"/>
+        <w:gridCol w:w="3600"/>
+        <w:gridCol w:w="1200"/>
       </w:tblGrid>
       <w:tr>
         <w:trPr>
@@ -2667,7 +3057,7 @@
                 <w:color w:val="FFFFFF"/>
                 <w:sz w:val="18"/>
               </w:rPr>
-              <w:t xml:space="preserve">预测长度</w:t>
+              <w:t xml:space="preserve">MSE mean ± std</w:t>
             </w:r>
           </w:p>
         </w:tc>
@@ -2690,7 +3080,7 @@
                 <w:color w:val="FFFFFF"/>
                 <w:sz w:val="18"/>
               </w:rPr>
-              <w:t xml:space="preserve">MSE均值</w:t>
+              <w:t xml:space="preserve">MAE mean ± std</w:t>
             </w:r>
           </w:p>
         </w:tc>
@@ -2713,10 +3103,312 @@
                 <w:color w:val="FFFFFF"/>
                 <w:sz w:val="18"/>
               </w:rPr>
-              <w:t xml:space="preserve">MSE标准差</w:t>
-            </w:r>
-          </w:p>
-        </w:tc>
+              <w:t xml:space="preserve">轮数</w:t>
+            </w:r>
+          </w:p>
+        </w:tc>
+      </w:tr>
+      <w:tr>
+        <w:tc>
+          <w:p>
+            <w:pPr>
+              <w:spacing w:after="20" w:line="276" w:lineRule="auto"/>
+            </w:pPr>
+            <w:r>
+              <w:rPr>
+                <w:rFonts w:ascii="Microsoft YaHei" w:hAnsi="Microsoft YaHei" w:eastAsia="Microsoft YaHei"/>
+                <w:sz w:val="18"/>
+              </w:rPr>
+              <w:t xml:space="preserve">DMSAFormer</w:t>
+            </w:r>
+          </w:p>
+        </w:tc>
+        <w:tc>
+          <w:p>
+            <w:pPr>
+              <w:spacing w:after="20" w:line="276" w:lineRule="auto"/>
+            </w:pPr>
+            <w:r>
+              <w:rPr>
+                <w:rFonts w:ascii="Microsoft YaHei" w:hAnsi="Microsoft YaHei" w:eastAsia="Microsoft YaHei"/>
+                <w:sz w:val="18"/>
+              </w:rPr>
+              <w:t xml:space="preserve">153907.02 ± 2207.87</w:t>
+            </w:r>
+          </w:p>
+        </w:tc>
+        <w:tc>
+          <w:p>
+            <w:pPr>
+              <w:spacing w:after="20" w:line="276" w:lineRule="auto"/>
+            </w:pPr>
+            <w:r>
+              <w:rPr>
+                <w:rFonts w:ascii="Microsoft YaHei" w:hAnsi="Microsoft YaHei" w:eastAsia="Microsoft YaHei"/>
+                <w:sz w:val="18"/>
+              </w:rPr>
+              <w:t xml:space="preserve">301.13 ± 2.40</w:t>
+            </w:r>
+          </w:p>
+        </w:tc>
+        <w:tc>
+          <w:p>
+            <w:pPr>
+              <w:spacing w:after="20" w:line="276" w:lineRule="auto"/>
+              <w:jc w:val="right"/>
+            </w:pPr>
+            <w:r>
+              <w:rPr>
+                <w:rFonts w:ascii="Microsoft YaHei" w:hAnsi="Microsoft YaHei" w:eastAsia="Microsoft YaHei"/>
+                <w:sz w:val="18"/>
+              </w:rPr>
+              <w:t xml:space="preserve">5</w:t>
+            </w:r>
+          </w:p>
+        </w:tc>
+      </w:tr>
+      <w:tr>
+        <w:tc>
+          <w:tcPr>
+            <w:shd w:val="clear" w:fill="F4F8FB"/>
+          </w:tcPr>
+          <w:p>
+            <w:pPr>
+              <w:spacing w:after="20" w:line="276" w:lineRule="auto"/>
+            </w:pPr>
+            <w:r>
+              <w:rPr>
+                <w:rFonts w:ascii="Microsoft YaHei" w:hAnsi="Microsoft YaHei" w:eastAsia="Microsoft YaHei"/>
+                <w:sz w:val="18"/>
+              </w:rPr>
+              <w:t xml:space="preserve">HybridTCNTransformer</w:t>
+            </w:r>
+          </w:p>
+        </w:tc>
+        <w:tc>
+          <w:tcPr>
+            <w:shd w:val="clear" w:fill="F4F8FB"/>
+          </w:tcPr>
+          <w:p>
+            <w:pPr>
+              <w:spacing w:after="20" w:line="276" w:lineRule="auto"/>
+            </w:pPr>
+            <w:r>
+              <w:rPr>
+                <w:rFonts w:ascii="Microsoft YaHei" w:hAnsi="Microsoft YaHei" w:eastAsia="Microsoft YaHei"/>
+                <w:sz w:val="18"/>
+              </w:rPr>
+              <w:t xml:space="preserve">155633.44 ± 3504.55</w:t>
+            </w:r>
+          </w:p>
+        </w:tc>
+        <w:tc>
+          <w:tcPr>
+            <w:shd w:val="clear" w:fill="F4F8FB"/>
+          </w:tcPr>
+          <w:p>
+            <w:pPr>
+              <w:spacing w:after="20" w:line="276" w:lineRule="auto"/>
+            </w:pPr>
+            <w:r>
+              <w:rPr>
+                <w:rFonts w:ascii="Microsoft YaHei" w:hAnsi="Microsoft YaHei" w:eastAsia="Microsoft YaHei"/>
+                <w:sz w:val="18"/>
+              </w:rPr>
+              <w:t xml:space="preserve">302.21 ± 2.73</w:t>
+            </w:r>
+          </w:p>
+        </w:tc>
+        <w:tc>
+          <w:tcPr>
+            <w:shd w:val="clear" w:fill="F4F8FB"/>
+          </w:tcPr>
+          <w:p>
+            <w:pPr>
+              <w:spacing w:after="20" w:line="276" w:lineRule="auto"/>
+              <w:jc w:val="right"/>
+            </w:pPr>
+            <w:r>
+              <w:rPr>
+                <w:rFonts w:ascii="Microsoft YaHei" w:hAnsi="Microsoft YaHei" w:eastAsia="Microsoft YaHei"/>
+                <w:sz w:val="18"/>
+              </w:rPr>
+              <w:t xml:space="preserve">5</w:t>
+            </w:r>
+          </w:p>
+        </w:tc>
+      </w:tr>
+      <w:tr>
+        <w:tc>
+          <w:p>
+            <w:pPr>
+              <w:spacing w:after="20" w:line="276" w:lineRule="auto"/>
+            </w:pPr>
+            <w:r>
+              <w:rPr>
+                <w:rFonts w:ascii="Microsoft YaHei" w:hAnsi="Microsoft YaHei" w:eastAsia="Microsoft YaHei"/>
+                <w:sz w:val="18"/>
+              </w:rPr>
+              <w:t xml:space="preserve">Transformer</w:t>
+            </w:r>
+          </w:p>
+        </w:tc>
+        <w:tc>
+          <w:p>
+            <w:pPr>
+              <w:spacing w:after="20" w:line="276" w:lineRule="auto"/>
+            </w:pPr>
+            <w:r>
+              <w:rPr>
+                <w:rFonts w:ascii="Microsoft YaHei" w:hAnsi="Microsoft YaHei" w:eastAsia="Microsoft YaHei"/>
+                <w:sz w:val="18"/>
+              </w:rPr>
+              <w:t xml:space="preserve">156632.34 ± 3657.48</w:t>
+            </w:r>
+          </w:p>
+        </w:tc>
+        <w:tc>
+          <w:p>
+            <w:pPr>
+              <w:spacing w:after="20" w:line="276" w:lineRule="auto"/>
+            </w:pPr>
+            <w:r>
+              <w:rPr>
+                <w:rFonts w:ascii="Microsoft YaHei" w:hAnsi="Microsoft YaHei" w:eastAsia="Microsoft YaHei"/>
+                <w:sz w:val="18"/>
+              </w:rPr>
+              <w:t xml:space="preserve">305.30 ± 4.98</w:t>
+            </w:r>
+          </w:p>
+        </w:tc>
+        <w:tc>
+          <w:p>
+            <w:pPr>
+              <w:spacing w:after="20" w:line="276" w:lineRule="auto"/>
+              <w:jc w:val="right"/>
+            </w:pPr>
+            <w:r>
+              <w:rPr>
+                <w:rFonts w:ascii="Microsoft YaHei" w:hAnsi="Microsoft YaHei" w:eastAsia="Microsoft YaHei"/>
+                <w:sz w:val="18"/>
+              </w:rPr>
+              <w:t xml:space="preserve">5</w:t>
+            </w:r>
+          </w:p>
+        </w:tc>
+      </w:tr>
+      <w:tr>
+        <w:tc>
+          <w:tcPr>
+            <w:shd w:val="clear" w:fill="F4F8FB"/>
+          </w:tcPr>
+          <w:p>
+            <w:pPr>
+              <w:spacing w:after="20" w:line="276" w:lineRule="auto"/>
+            </w:pPr>
+            <w:r>
+              <w:rPr>
+                <w:rFonts w:ascii="Microsoft YaHei" w:hAnsi="Microsoft YaHei" w:eastAsia="Microsoft YaHei"/>
+                <w:sz w:val="18"/>
+              </w:rPr>
+              <w:t xml:space="preserve">LSTM</w:t>
+            </w:r>
+          </w:p>
+        </w:tc>
+        <w:tc>
+          <w:tcPr>
+            <w:shd w:val="clear" w:fill="F4F8FB"/>
+          </w:tcPr>
+          <w:p>
+            <w:pPr>
+              <w:spacing w:after="20" w:line="276" w:lineRule="auto"/>
+            </w:pPr>
+            <w:r>
+              <w:rPr>
+                <w:rFonts w:ascii="Microsoft YaHei" w:hAnsi="Microsoft YaHei" w:eastAsia="Microsoft YaHei"/>
+                <w:sz w:val="18"/>
+              </w:rPr>
+              <w:t xml:space="preserve">163266.74 ± 1593.57</w:t>
+            </w:r>
+          </w:p>
+        </w:tc>
+        <w:tc>
+          <w:tcPr>
+            <w:shd w:val="clear" w:fill="F4F8FB"/>
+          </w:tcPr>
+          <w:p>
+            <w:pPr>
+              <w:spacing w:after="20" w:line="276" w:lineRule="auto"/>
+            </w:pPr>
+            <w:r>
+              <w:rPr>
+                <w:rFonts w:ascii="Microsoft YaHei" w:hAnsi="Microsoft YaHei" w:eastAsia="Microsoft YaHei"/>
+                <w:sz w:val="18"/>
+              </w:rPr>
+              <w:t xml:space="preserve">312.45 ± 2.17</w:t>
+            </w:r>
+          </w:p>
+        </w:tc>
+        <w:tc>
+          <w:tcPr>
+            <w:shd w:val="clear" w:fill="F4F8FB"/>
+          </w:tcPr>
+          <w:p>
+            <w:pPr>
+              <w:spacing w:after="20" w:line="276" w:lineRule="auto"/>
+              <w:jc w:val="right"/>
+            </w:pPr>
+            <w:r>
+              <w:rPr>
+                <w:rFonts w:ascii="Microsoft YaHei" w:hAnsi="Microsoft YaHei" w:eastAsia="Microsoft YaHei"/>
+                <w:sz w:val="18"/>
+              </w:rPr>
+              <w:t xml:space="preserve">5</w:t>
+            </w:r>
+          </w:p>
+        </w:tc>
+      </w:tr>
+    </w:tbl>
+    <w:p>
+      <w:pPr>
+        <w:pStyle w:val="Heading3"/>
+        <w:keepNext/>
+        <w:spacing w:before="160" w:after="80"/>
+      </w:pPr>
+      <w:r>
+        <w:rPr>
+          <w:b/>
+          <w:color w:val="17365D"/>
+          <w:sz w:val="24"/>
+        </w:rPr>
+        <w:t xml:space="preserve">365 天预测结果</w:t>
+      </w:r>
+    </w:p>
+    <w:tbl>
+      <w:tblPr>
+        <w:tblStyle w:val="light1"/>
+        <w:tblW w:w="5000" w:type="pct"/>
+        <w:tblBorders>
+          <w:top w:val="single" w:sz="4"/>
+          <w:left w:val="single" w:sz="4"/>
+          <w:bottom w:val="single" w:sz="4"/>
+          <w:right w:val="single" w:sz="4"/>
+          <w:insideH w:val="single" w:sz="4"/>
+          <w:insideV w:val="single" w:sz="4"/>
+        </w:tblBorders>
+        <w:tblLayout w:type="fixed"/>
+        <w:tblLook w:val="04A0"/>
+      </w:tblPr>
+      <w:tblGrid>
+        <w:gridCol w:w="3600"/>
+        <w:gridCol w:w="3600"/>
+        <w:gridCol w:w="3600"/>
+        <w:gridCol w:w="1200"/>
+      </w:tblGrid>
+      <w:tr>
+        <w:trPr>
+          <w:tblHeader/>
+        </w:trPr>
         <w:tc>
           <w:tcPr>
             <w:shd w:val="clear" w:fill="1F4E79"/>
@@ -2736,7 +3428,7 @@
                 <w:color w:val="FFFFFF"/>
                 <w:sz w:val="18"/>
               </w:rPr>
-              <w:t xml:space="preserve">MAE均值</w:t>
+              <w:t xml:space="preserve">模型</w:t>
             </w:r>
           </w:p>
         </w:tc>
@@ -2759,7 +3451,7 @@
                 <w:color w:val="FFFFFF"/>
                 <w:sz w:val="18"/>
               </w:rPr>
-              <w:t xml:space="preserve">MAE标准差</w:t>
+              <w:t xml:space="preserve">MSE mean ± std</w:t>
             </w:r>
           </w:p>
         </w:tc>
@@ -2782,6 +3474,29 @@
                 <w:color w:val="FFFFFF"/>
                 <w:sz w:val="18"/>
               </w:rPr>
+              <w:t xml:space="preserve">MAE mean ± std</w:t>
+            </w:r>
+          </w:p>
+        </w:tc>
+        <w:tc>
+          <w:tcPr>
+            <w:shd w:val="clear" w:fill="1F4E79"/>
+            <w:vAlign w:val="center"/>
+          </w:tcPr>
+          <w:p>
+            <w:pPr>
+              <w:pBdr>
+                <w:bottom w:val="single" w:color="17365D" w:sz="8" w:space="0"/>
+              </w:pBdr>
+              <w:jc w:val="center"/>
+            </w:pPr>
+            <w:r>
+              <w:rPr>
+                <w:rFonts w:ascii="Microsoft YaHei" w:hAnsi="Microsoft YaHei" w:eastAsia="Microsoft YaHei"/>
+                <w:b/>
+                <w:color w:val="FFFFFF"/>
+                <w:sz w:val="18"/>
+              </w:rPr>
               <w:t xml:space="preserve">轮数</w:t>
             </w:r>
           </w:p>
@@ -2796,7 +3511,7 @@
             <w:r>
               <w:rPr>
                 <w:rFonts w:ascii="Microsoft YaHei" w:hAnsi="Microsoft YaHei" w:eastAsia="Microsoft YaHei"/>
-                <w:sz w:val="17"/>
+                <w:sz w:val="18"/>
               </w:rPr>
               <w:t xml:space="preserve">DMSAFormer</w:t>
             </w:r>
@@ -2806,87 +3521,40 @@
           <w:p>
             <w:pPr>
               <w:spacing w:after="20" w:line="276" w:lineRule="auto"/>
+            </w:pPr>
+            <w:r>
+              <w:rPr>
+                <w:rFonts w:ascii="Microsoft YaHei" w:hAnsi="Microsoft YaHei" w:eastAsia="Microsoft YaHei"/>
+                <w:sz w:val="18"/>
+              </w:rPr>
+              <w:t xml:space="preserve">272821.28 ± 7078.78</w:t>
+            </w:r>
+          </w:p>
+        </w:tc>
+        <w:tc>
+          <w:p>
+            <w:pPr>
+              <w:spacing w:after="20" w:line="276" w:lineRule="auto"/>
+            </w:pPr>
+            <w:r>
+              <w:rPr>
+                <w:rFonts w:ascii="Microsoft YaHei" w:hAnsi="Microsoft YaHei" w:eastAsia="Microsoft YaHei"/>
+                <w:sz w:val="18"/>
+              </w:rPr>
+              <w:t xml:space="preserve">409.59 ± 5.90</w:t>
+            </w:r>
+          </w:p>
+        </w:tc>
+        <w:tc>
+          <w:p>
+            <w:pPr>
+              <w:spacing w:after="20" w:line="276" w:lineRule="auto"/>
               <w:jc w:val="right"/>
             </w:pPr>
             <w:r>
               <w:rPr>
                 <w:rFonts w:ascii="Microsoft YaHei" w:hAnsi="Microsoft YaHei" w:eastAsia="Microsoft YaHei"/>
-                <w:sz w:val="17"/>
-              </w:rPr>
-              <w:t xml:space="preserve">90</w:t>
-            </w:r>
-          </w:p>
-        </w:tc>
-        <w:tc>
-          <w:p>
-            <w:pPr>
-              <w:spacing w:after="20" w:line="276" w:lineRule="auto"/>
-              <w:jc w:val="right"/>
-            </w:pPr>
-            <w:r>
-              <w:rPr>
-                <w:rFonts w:ascii="Microsoft YaHei" w:hAnsi="Microsoft YaHei" w:eastAsia="Microsoft YaHei"/>
-                <w:sz w:val="17"/>
-              </w:rPr>
-              <w:t xml:space="preserve">153907.015</w:t>
-            </w:r>
-          </w:p>
-        </w:tc>
-        <w:tc>
-          <w:p>
-            <w:pPr>
-              <w:spacing w:after="20" w:line="276" w:lineRule="auto"/>
-              <w:jc w:val="right"/>
-            </w:pPr>
-            <w:r>
-              <w:rPr>
-                <w:rFonts w:ascii="Microsoft YaHei" w:hAnsi="Microsoft YaHei" w:eastAsia="Microsoft YaHei"/>
-                <w:sz w:val="17"/>
-              </w:rPr>
-              <w:t xml:space="preserve">2207.872</w:t>
-            </w:r>
-          </w:p>
-        </w:tc>
-        <w:tc>
-          <w:p>
-            <w:pPr>
-              <w:spacing w:after="20" w:line="276" w:lineRule="auto"/>
-              <w:jc w:val="right"/>
-            </w:pPr>
-            <w:r>
-              <w:rPr>
-                <w:rFonts w:ascii="Microsoft YaHei" w:hAnsi="Microsoft YaHei" w:eastAsia="Microsoft YaHei"/>
-                <w:sz w:val="17"/>
-              </w:rPr>
-              <w:t xml:space="preserve">301.130</w:t>
-            </w:r>
-          </w:p>
-        </w:tc>
-        <w:tc>
-          <w:p>
-            <w:pPr>
-              <w:spacing w:after="20" w:line="276" w:lineRule="auto"/>
-              <w:jc w:val="right"/>
-            </w:pPr>
-            <w:r>
-              <w:rPr>
-                <w:rFonts w:ascii="Microsoft YaHei" w:hAnsi="Microsoft YaHei" w:eastAsia="Microsoft YaHei"/>
-                <w:sz w:val="17"/>
-              </w:rPr>
-              <w:t xml:space="preserve">2.397</w:t>
-            </w:r>
-          </w:p>
-        </w:tc>
-        <w:tc>
-          <w:p>
-            <w:pPr>
-              <w:spacing w:after="20" w:line="276" w:lineRule="auto"/>
-              <w:jc w:val="right"/>
-            </w:pPr>
-            <w:r>
-              <w:rPr>
-                <w:rFonts w:ascii="Microsoft YaHei" w:hAnsi="Microsoft YaHei" w:eastAsia="Microsoft YaHei"/>
-                <w:sz w:val="17"/>
+                <w:sz w:val="18"/>
               </w:rPr>
               <w:t xml:space="preserve">5</w:t>
             </w:r>
@@ -2905,9 +3573,9 @@
             <w:r>
               <w:rPr>
                 <w:rFonts w:ascii="Microsoft YaHei" w:hAnsi="Microsoft YaHei" w:eastAsia="Microsoft YaHei"/>
-                <w:sz w:val="17"/>
-              </w:rPr>
-              <w:t xml:space="preserve">Hybrid</w:t>
+                <w:sz w:val="18"/>
+              </w:rPr>
+              <w:t xml:space="preserve">LSTM</w:t>
             </w:r>
           </w:p>
         </w:tc>
@@ -2918,102 +3586,46 @@
           <w:p>
             <w:pPr>
               <w:spacing w:after="20" w:line="276" w:lineRule="auto"/>
+            </w:pPr>
+            <w:r>
+              <w:rPr>
+                <w:rFonts w:ascii="Microsoft YaHei" w:hAnsi="Microsoft YaHei" w:eastAsia="Microsoft YaHei"/>
+                <w:sz w:val="18"/>
+              </w:rPr>
+              <w:t xml:space="preserve">316352.06 ± 16271.97</w:t>
+            </w:r>
+          </w:p>
+        </w:tc>
+        <w:tc>
+          <w:tcPr>
+            <w:shd w:val="clear" w:fill="F4F8FB"/>
+          </w:tcPr>
+          <w:p>
+            <w:pPr>
+              <w:spacing w:after="20" w:line="276" w:lineRule="auto"/>
+            </w:pPr>
+            <w:r>
+              <w:rPr>
+                <w:rFonts w:ascii="Microsoft YaHei" w:hAnsi="Microsoft YaHei" w:eastAsia="Microsoft YaHei"/>
+                <w:sz w:val="18"/>
+              </w:rPr>
+              <w:t xml:space="preserve">446.40 ± 12.26</w:t>
+            </w:r>
+          </w:p>
+        </w:tc>
+        <w:tc>
+          <w:tcPr>
+            <w:shd w:val="clear" w:fill="F4F8FB"/>
+          </w:tcPr>
+          <w:p>
+            <w:pPr>
+              <w:spacing w:after="20" w:line="276" w:lineRule="auto"/>
               <w:jc w:val="right"/>
             </w:pPr>
             <w:r>
               <w:rPr>
                 <w:rFonts w:ascii="Microsoft YaHei" w:hAnsi="Microsoft YaHei" w:eastAsia="Microsoft YaHei"/>
-                <w:sz w:val="17"/>
-              </w:rPr>
-              <w:t xml:space="preserve">90</w:t>
-            </w:r>
-          </w:p>
-        </w:tc>
-        <w:tc>
-          <w:tcPr>
-            <w:shd w:val="clear" w:fill="F4F8FB"/>
-          </w:tcPr>
-          <w:p>
-            <w:pPr>
-              <w:spacing w:after="20" w:line="276" w:lineRule="auto"/>
-              <w:jc w:val="right"/>
-            </w:pPr>
-            <w:r>
-              <w:rPr>
-                <w:rFonts w:ascii="Microsoft YaHei" w:hAnsi="Microsoft YaHei" w:eastAsia="Microsoft YaHei"/>
-                <w:sz w:val="17"/>
-              </w:rPr>
-              <w:t xml:space="preserve">155633.435</w:t>
-            </w:r>
-          </w:p>
-        </w:tc>
-        <w:tc>
-          <w:tcPr>
-            <w:shd w:val="clear" w:fill="F4F8FB"/>
-          </w:tcPr>
-          <w:p>
-            <w:pPr>
-              <w:spacing w:after="20" w:line="276" w:lineRule="auto"/>
-              <w:jc w:val="right"/>
-            </w:pPr>
-            <w:r>
-              <w:rPr>
-                <w:rFonts w:ascii="Microsoft YaHei" w:hAnsi="Microsoft YaHei" w:eastAsia="Microsoft YaHei"/>
-                <w:sz w:val="17"/>
-              </w:rPr>
-              <w:t xml:space="preserve">3504.548</w:t>
-            </w:r>
-          </w:p>
-        </w:tc>
-        <w:tc>
-          <w:tcPr>
-            <w:shd w:val="clear" w:fill="F4F8FB"/>
-          </w:tcPr>
-          <w:p>
-            <w:pPr>
-              <w:spacing w:after="20" w:line="276" w:lineRule="auto"/>
-              <w:jc w:val="right"/>
-            </w:pPr>
-            <w:r>
-              <w:rPr>
-                <w:rFonts w:ascii="Microsoft YaHei" w:hAnsi="Microsoft YaHei" w:eastAsia="Microsoft YaHei"/>
-                <w:sz w:val="17"/>
-              </w:rPr>
-              <w:t xml:space="preserve">302.206</w:t>
-            </w:r>
-          </w:p>
-        </w:tc>
-        <w:tc>
-          <w:tcPr>
-            <w:shd w:val="clear" w:fill="F4F8FB"/>
-          </w:tcPr>
-          <w:p>
-            <w:pPr>
-              <w:spacing w:after="20" w:line="276" w:lineRule="auto"/>
-              <w:jc w:val="right"/>
-            </w:pPr>
-            <w:r>
-              <w:rPr>
-                <w:rFonts w:ascii="Microsoft YaHei" w:hAnsi="Microsoft YaHei" w:eastAsia="Microsoft YaHei"/>
-                <w:sz w:val="17"/>
-              </w:rPr>
-              <w:t xml:space="preserve">2.726</w:t>
-            </w:r>
-          </w:p>
-        </w:tc>
-        <w:tc>
-          <w:tcPr>
-            <w:shd w:val="clear" w:fill="F4F8FB"/>
-          </w:tcPr>
-          <w:p>
-            <w:pPr>
-              <w:spacing w:after="20" w:line="276" w:lineRule="auto"/>
-              <w:jc w:val="right"/>
-            </w:pPr>
-            <w:r>
-              <w:rPr>
-                <w:rFonts w:ascii="Microsoft YaHei" w:hAnsi="Microsoft YaHei" w:eastAsia="Microsoft YaHei"/>
-                <w:sz w:val="17"/>
+                <w:sz w:val="18"/>
               </w:rPr>
               <w:t xml:space="preserve">5</w:t>
             </w:r>
@@ -3029,9 +3641,37 @@
             <w:r>
               <w:rPr>
                 <w:rFonts w:ascii="Microsoft YaHei" w:hAnsi="Microsoft YaHei" w:eastAsia="Microsoft YaHei"/>
-                <w:sz w:val="17"/>
-              </w:rPr>
-              <w:t xml:space="preserve">LSTM</w:t>
+                <w:sz w:val="18"/>
+              </w:rPr>
+              <w:t xml:space="preserve">HybridTCNTransformer</w:t>
+            </w:r>
+          </w:p>
+        </w:tc>
+        <w:tc>
+          <w:p>
+            <w:pPr>
+              <w:spacing w:after="20" w:line="276" w:lineRule="auto"/>
+            </w:pPr>
+            <w:r>
+              <w:rPr>
+                <w:rFonts w:ascii="Microsoft YaHei" w:hAnsi="Microsoft YaHei" w:eastAsia="Microsoft YaHei"/>
+                <w:sz w:val="18"/>
+              </w:rPr>
+              <w:t xml:space="preserve">368574.75 ± 43798.41</w:t>
+            </w:r>
+          </w:p>
+        </w:tc>
+        <w:tc>
+          <w:p>
+            <w:pPr>
+              <w:spacing w:after="20" w:line="276" w:lineRule="auto"/>
+            </w:pPr>
+            <w:r>
+              <w:rPr>
+                <w:rFonts w:ascii="Microsoft YaHei" w:hAnsi="Microsoft YaHei" w:eastAsia="Microsoft YaHei"/>
+                <w:sz w:val="18"/>
+              </w:rPr>
+              <w:t xml:space="preserve">491.58 ± 35.25</w:t>
             </w:r>
           </w:p>
         </w:tc>
@@ -3044,82 +3684,7 @@
             <w:r>
               <w:rPr>
                 <w:rFonts w:ascii="Microsoft YaHei" w:hAnsi="Microsoft YaHei" w:eastAsia="Microsoft YaHei"/>
-                <w:sz w:val="17"/>
-              </w:rPr>
-              <w:t xml:space="preserve">90</w:t>
-            </w:r>
-          </w:p>
-        </w:tc>
-        <w:tc>
-          <w:p>
-            <w:pPr>
-              <w:spacing w:after="20" w:line="276" w:lineRule="auto"/>
-              <w:jc w:val="right"/>
-            </w:pPr>
-            <w:r>
-              <w:rPr>
-                <w:rFonts w:ascii="Microsoft YaHei" w:hAnsi="Microsoft YaHei" w:eastAsia="Microsoft YaHei"/>
-                <w:sz w:val="17"/>
-              </w:rPr>
-              <w:t xml:space="preserve">163266.742</w:t>
-            </w:r>
-          </w:p>
-        </w:tc>
-        <w:tc>
-          <w:p>
-            <w:pPr>
-              <w:spacing w:after="20" w:line="276" w:lineRule="auto"/>
-              <w:jc w:val="right"/>
-            </w:pPr>
-            <w:r>
-              <w:rPr>
-                <w:rFonts w:ascii="Microsoft YaHei" w:hAnsi="Microsoft YaHei" w:eastAsia="Microsoft YaHei"/>
-                <w:sz w:val="17"/>
-              </w:rPr>
-              <w:t xml:space="preserve">1593.568</w:t>
-            </w:r>
-          </w:p>
-        </w:tc>
-        <w:tc>
-          <w:p>
-            <w:pPr>
-              <w:spacing w:after="20" w:line="276" w:lineRule="auto"/>
-              <w:jc w:val="right"/>
-            </w:pPr>
-            <w:r>
-              <w:rPr>
-                <w:rFonts w:ascii="Microsoft YaHei" w:hAnsi="Microsoft YaHei" w:eastAsia="Microsoft YaHei"/>
-                <w:sz w:val="17"/>
-              </w:rPr>
-              <w:t xml:space="preserve">312.448</w:t>
-            </w:r>
-          </w:p>
-        </w:tc>
-        <w:tc>
-          <w:p>
-            <w:pPr>
-              <w:spacing w:after="20" w:line="276" w:lineRule="auto"/>
-              <w:jc w:val="right"/>
-            </w:pPr>
-            <w:r>
-              <w:rPr>
-                <w:rFonts w:ascii="Microsoft YaHei" w:hAnsi="Microsoft YaHei" w:eastAsia="Microsoft YaHei"/>
-                <w:sz w:val="17"/>
-              </w:rPr>
-              <w:t xml:space="preserve">2.165</w:t>
-            </w:r>
-          </w:p>
-        </w:tc>
-        <w:tc>
-          <w:p>
-            <w:pPr>
-              <w:spacing w:after="20" w:line="276" w:lineRule="auto"/>
-              <w:jc w:val="right"/>
-            </w:pPr>
-            <w:r>
-              <w:rPr>
-                <w:rFonts w:ascii="Microsoft YaHei" w:hAnsi="Microsoft YaHei" w:eastAsia="Microsoft YaHei"/>
-                <w:sz w:val="17"/>
+                <w:sz w:val="18"/>
               </w:rPr>
               <w:t xml:space="preserve">5</w:t>
             </w:r>
@@ -3138,7 +3703,7 @@
             <w:r>
               <w:rPr>
                 <w:rFonts w:ascii="Microsoft YaHei" w:hAnsi="Microsoft YaHei" w:eastAsia="Microsoft YaHei"/>
-                <w:sz w:val="17"/>
+                <w:sz w:val="18"/>
               </w:rPr>
               <w:t xml:space="preserve">Transformer</w:t>
             </w:r>
@@ -3151,568 +3716,46 @@
           <w:p>
             <w:pPr>
               <w:spacing w:after="20" w:line="276" w:lineRule="auto"/>
+            </w:pPr>
+            <w:r>
+              <w:rPr>
+                <w:rFonts w:ascii="Microsoft YaHei" w:hAnsi="Microsoft YaHei" w:eastAsia="Microsoft YaHei"/>
+                <w:sz w:val="18"/>
+              </w:rPr>
+              <w:t xml:space="preserve">442238.94 ± 45530.66</w:t>
+            </w:r>
+          </w:p>
+        </w:tc>
+        <w:tc>
+          <w:tcPr>
+            <w:shd w:val="clear" w:fill="F4F8FB"/>
+          </w:tcPr>
+          <w:p>
+            <w:pPr>
+              <w:spacing w:after="20" w:line="276" w:lineRule="auto"/>
+            </w:pPr>
+            <w:r>
+              <w:rPr>
+                <w:rFonts w:ascii="Microsoft YaHei" w:hAnsi="Microsoft YaHei" w:eastAsia="Microsoft YaHei"/>
+                <w:sz w:val="18"/>
+              </w:rPr>
+              <w:t xml:space="preserve">545.82 ± 32.61</w:t>
+            </w:r>
+          </w:p>
+        </w:tc>
+        <w:tc>
+          <w:tcPr>
+            <w:shd w:val="clear" w:fill="F4F8FB"/>
+          </w:tcPr>
+          <w:p>
+            <w:pPr>
+              <w:spacing w:after="20" w:line="276" w:lineRule="auto"/>
               <w:jc w:val="right"/>
             </w:pPr>
             <w:r>
               <w:rPr>
                 <w:rFonts w:ascii="Microsoft YaHei" w:hAnsi="Microsoft YaHei" w:eastAsia="Microsoft YaHei"/>
-                <w:sz w:val="17"/>
-              </w:rPr>
-              <w:t xml:space="preserve">90</w:t>
-            </w:r>
-          </w:p>
-        </w:tc>
-        <w:tc>
-          <w:tcPr>
-            <w:shd w:val="clear" w:fill="F4F8FB"/>
-          </w:tcPr>
-          <w:p>
-            <w:pPr>
-              <w:spacing w:after="20" w:line="276" w:lineRule="auto"/>
-              <w:jc w:val="right"/>
-            </w:pPr>
-            <w:r>
-              <w:rPr>
-                <w:rFonts w:ascii="Microsoft YaHei" w:hAnsi="Microsoft YaHei" w:eastAsia="Microsoft YaHei"/>
-                <w:sz w:val="17"/>
-              </w:rPr>
-              <w:t xml:space="preserve">156632.342</w:t>
-            </w:r>
-          </w:p>
-        </w:tc>
-        <w:tc>
-          <w:tcPr>
-            <w:shd w:val="clear" w:fill="F4F8FB"/>
-          </w:tcPr>
-          <w:p>
-            <w:pPr>
-              <w:spacing w:after="20" w:line="276" w:lineRule="auto"/>
-              <w:jc w:val="right"/>
-            </w:pPr>
-            <w:r>
-              <w:rPr>
-                <w:rFonts w:ascii="Microsoft YaHei" w:hAnsi="Microsoft YaHei" w:eastAsia="Microsoft YaHei"/>
-                <w:sz w:val="17"/>
-              </w:rPr>
-              <w:t xml:space="preserve">3657.476</w:t>
-            </w:r>
-          </w:p>
-        </w:tc>
-        <w:tc>
-          <w:tcPr>
-            <w:shd w:val="clear" w:fill="F4F8FB"/>
-          </w:tcPr>
-          <w:p>
-            <w:pPr>
-              <w:spacing w:after="20" w:line="276" w:lineRule="auto"/>
-              <w:jc w:val="right"/>
-            </w:pPr>
-            <w:r>
-              <w:rPr>
-                <w:rFonts w:ascii="Microsoft YaHei" w:hAnsi="Microsoft YaHei" w:eastAsia="Microsoft YaHei"/>
-                <w:sz w:val="17"/>
-              </w:rPr>
-              <w:t xml:space="preserve">305.301</w:t>
-            </w:r>
-          </w:p>
-        </w:tc>
-        <w:tc>
-          <w:tcPr>
-            <w:shd w:val="clear" w:fill="F4F8FB"/>
-          </w:tcPr>
-          <w:p>
-            <w:pPr>
-              <w:spacing w:after="20" w:line="276" w:lineRule="auto"/>
-              <w:jc w:val="right"/>
-            </w:pPr>
-            <w:r>
-              <w:rPr>
-                <w:rFonts w:ascii="Microsoft YaHei" w:hAnsi="Microsoft YaHei" w:eastAsia="Microsoft YaHei"/>
-                <w:sz w:val="17"/>
-              </w:rPr>
-              <w:t xml:space="preserve">4.984</w:t>
-            </w:r>
-          </w:p>
-        </w:tc>
-        <w:tc>
-          <w:tcPr>
-            <w:shd w:val="clear" w:fill="F4F8FB"/>
-          </w:tcPr>
-          <w:p>
-            <w:pPr>
-              <w:spacing w:after="20" w:line="276" w:lineRule="auto"/>
-              <w:jc w:val="right"/>
-            </w:pPr>
-            <w:r>
-              <w:rPr>
-                <w:rFonts w:ascii="Microsoft YaHei" w:hAnsi="Microsoft YaHei" w:eastAsia="Microsoft YaHei"/>
-                <w:sz w:val="17"/>
-              </w:rPr>
-              <w:t xml:space="preserve">5</w:t>
-            </w:r>
-          </w:p>
-        </w:tc>
-      </w:tr>
-      <w:tr>
-        <w:tc>
-          <w:p>
-            <w:pPr>
-              <w:spacing w:after="20" w:line="276" w:lineRule="auto"/>
-            </w:pPr>
-            <w:r>
-              <w:rPr>
-                <w:rFonts w:ascii="Microsoft YaHei" w:hAnsi="Microsoft YaHei" w:eastAsia="Microsoft YaHei"/>
-                <w:sz w:val="17"/>
-              </w:rPr>
-              <w:t xml:space="preserve">DMSAFormer</w:t>
-            </w:r>
-          </w:p>
-        </w:tc>
-        <w:tc>
-          <w:p>
-            <w:pPr>
-              <w:spacing w:after="20" w:line="276" w:lineRule="auto"/>
-              <w:jc w:val="right"/>
-            </w:pPr>
-            <w:r>
-              <w:rPr>
-                <w:rFonts w:ascii="Microsoft YaHei" w:hAnsi="Microsoft YaHei" w:eastAsia="Microsoft YaHei"/>
-                <w:sz w:val="17"/>
-              </w:rPr>
-              <w:t xml:space="preserve">365</w:t>
-            </w:r>
-          </w:p>
-        </w:tc>
-        <w:tc>
-          <w:p>
-            <w:pPr>
-              <w:spacing w:after="20" w:line="276" w:lineRule="auto"/>
-              <w:jc w:val="right"/>
-            </w:pPr>
-            <w:r>
-              <w:rPr>
-                <w:rFonts w:ascii="Microsoft YaHei" w:hAnsi="Microsoft YaHei" w:eastAsia="Microsoft YaHei"/>
-                <w:sz w:val="17"/>
-              </w:rPr>
-              <w:t xml:space="preserve">272821.277</w:t>
-            </w:r>
-          </w:p>
-        </w:tc>
-        <w:tc>
-          <w:p>
-            <w:pPr>
-              <w:spacing w:after="20" w:line="276" w:lineRule="auto"/>
-              <w:jc w:val="right"/>
-            </w:pPr>
-            <w:r>
-              <w:rPr>
-                <w:rFonts w:ascii="Microsoft YaHei" w:hAnsi="Microsoft YaHei" w:eastAsia="Microsoft YaHei"/>
-                <w:sz w:val="17"/>
-              </w:rPr>
-              <w:t xml:space="preserve">7078.781</w:t>
-            </w:r>
-          </w:p>
-        </w:tc>
-        <w:tc>
-          <w:p>
-            <w:pPr>
-              <w:spacing w:after="20" w:line="276" w:lineRule="auto"/>
-              <w:jc w:val="right"/>
-            </w:pPr>
-            <w:r>
-              <w:rPr>
-                <w:rFonts w:ascii="Microsoft YaHei" w:hAnsi="Microsoft YaHei" w:eastAsia="Microsoft YaHei"/>
-                <w:sz w:val="17"/>
-              </w:rPr>
-              <w:t xml:space="preserve">409.585</w:t>
-            </w:r>
-          </w:p>
-        </w:tc>
-        <w:tc>
-          <w:p>
-            <w:pPr>
-              <w:spacing w:after="20" w:line="276" w:lineRule="auto"/>
-              <w:jc w:val="right"/>
-            </w:pPr>
-            <w:r>
-              <w:rPr>
-                <w:rFonts w:ascii="Microsoft YaHei" w:hAnsi="Microsoft YaHei" w:eastAsia="Microsoft YaHei"/>
-                <w:sz w:val="17"/>
-              </w:rPr>
-              <w:t xml:space="preserve">5.897</w:t>
-            </w:r>
-          </w:p>
-        </w:tc>
-        <w:tc>
-          <w:p>
-            <w:pPr>
-              <w:spacing w:after="20" w:line="276" w:lineRule="auto"/>
-              <w:jc w:val="right"/>
-            </w:pPr>
-            <w:r>
-              <w:rPr>
-                <w:rFonts w:ascii="Microsoft YaHei" w:hAnsi="Microsoft YaHei" w:eastAsia="Microsoft YaHei"/>
-                <w:sz w:val="17"/>
-              </w:rPr>
-              <w:t xml:space="preserve">5</w:t>
-            </w:r>
-          </w:p>
-        </w:tc>
-      </w:tr>
-      <w:tr>
-        <w:tc>
-          <w:tcPr>
-            <w:shd w:val="clear" w:fill="F4F8FB"/>
-          </w:tcPr>
-          <w:p>
-            <w:pPr>
-              <w:spacing w:after="20" w:line="276" w:lineRule="auto"/>
-            </w:pPr>
-            <w:r>
-              <w:rPr>
-                <w:rFonts w:ascii="Microsoft YaHei" w:hAnsi="Microsoft YaHei" w:eastAsia="Microsoft YaHei"/>
-                <w:sz w:val="17"/>
-              </w:rPr>
-              <w:t xml:space="preserve">Hybrid</w:t>
-            </w:r>
-          </w:p>
-        </w:tc>
-        <w:tc>
-          <w:tcPr>
-            <w:shd w:val="clear" w:fill="F4F8FB"/>
-          </w:tcPr>
-          <w:p>
-            <w:pPr>
-              <w:spacing w:after="20" w:line="276" w:lineRule="auto"/>
-              <w:jc w:val="right"/>
-            </w:pPr>
-            <w:r>
-              <w:rPr>
-                <w:rFonts w:ascii="Microsoft YaHei" w:hAnsi="Microsoft YaHei" w:eastAsia="Microsoft YaHei"/>
-                <w:sz w:val="17"/>
-              </w:rPr>
-              <w:t xml:space="preserve">365</w:t>
-            </w:r>
-          </w:p>
-        </w:tc>
-        <w:tc>
-          <w:tcPr>
-            <w:shd w:val="clear" w:fill="F4F8FB"/>
-          </w:tcPr>
-          <w:p>
-            <w:pPr>
-              <w:spacing w:after="20" w:line="276" w:lineRule="auto"/>
-              <w:jc w:val="right"/>
-            </w:pPr>
-            <w:r>
-              <w:rPr>
-                <w:rFonts w:ascii="Microsoft YaHei" w:hAnsi="Microsoft YaHei" w:eastAsia="Microsoft YaHei"/>
-                <w:sz w:val="17"/>
-              </w:rPr>
-              <w:t xml:space="preserve">368574.752</w:t>
-            </w:r>
-          </w:p>
-        </w:tc>
-        <w:tc>
-          <w:tcPr>
-            <w:shd w:val="clear" w:fill="F4F8FB"/>
-          </w:tcPr>
-          <w:p>
-            <w:pPr>
-              <w:spacing w:after="20" w:line="276" w:lineRule="auto"/>
-              <w:jc w:val="right"/>
-            </w:pPr>
-            <w:r>
-              <w:rPr>
-                <w:rFonts w:ascii="Microsoft YaHei" w:hAnsi="Microsoft YaHei" w:eastAsia="Microsoft YaHei"/>
-                <w:sz w:val="17"/>
-              </w:rPr>
-              <w:t xml:space="preserve">43798.405</w:t>
-            </w:r>
-          </w:p>
-        </w:tc>
-        <w:tc>
-          <w:tcPr>
-            <w:shd w:val="clear" w:fill="F4F8FB"/>
-          </w:tcPr>
-          <w:p>
-            <w:pPr>
-              <w:spacing w:after="20" w:line="276" w:lineRule="auto"/>
-              <w:jc w:val="right"/>
-            </w:pPr>
-            <w:r>
-              <w:rPr>
-                <w:rFonts w:ascii="Microsoft YaHei" w:hAnsi="Microsoft YaHei" w:eastAsia="Microsoft YaHei"/>
-                <w:sz w:val="17"/>
-              </w:rPr>
-              <w:t xml:space="preserve">491.580</w:t>
-            </w:r>
-          </w:p>
-        </w:tc>
-        <w:tc>
-          <w:tcPr>
-            <w:shd w:val="clear" w:fill="F4F8FB"/>
-          </w:tcPr>
-          <w:p>
-            <w:pPr>
-              <w:spacing w:after="20" w:line="276" w:lineRule="auto"/>
-              <w:jc w:val="right"/>
-            </w:pPr>
-            <w:r>
-              <w:rPr>
-                <w:rFonts w:ascii="Microsoft YaHei" w:hAnsi="Microsoft YaHei" w:eastAsia="Microsoft YaHei"/>
-                <w:sz w:val="17"/>
-              </w:rPr>
-              <w:t xml:space="preserve">35.249</w:t>
-            </w:r>
-          </w:p>
-        </w:tc>
-        <w:tc>
-          <w:tcPr>
-            <w:shd w:val="clear" w:fill="F4F8FB"/>
-          </w:tcPr>
-          <w:p>
-            <w:pPr>
-              <w:spacing w:after="20" w:line="276" w:lineRule="auto"/>
-              <w:jc w:val="right"/>
-            </w:pPr>
-            <w:r>
-              <w:rPr>
-                <w:rFonts w:ascii="Microsoft YaHei" w:hAnsi="Microsoft YaHei" w:eastAsia="Microsoft YaHei"/>
-                <w:sz w:val="17"/>
-              </w:rPr>
-              <w:t xml:space="preserve">5</w:t>
-            </w:r>
-          </w:p>
-        </w:tc>
-      </w:tr>
-      <w:tr>
-        <w:tc>
-          <w:p>
-            <w:pPr>
-              <w:spacing w:after="20" w:line="276" w:lineRule="auto"/>
-            </w:pPr>
-            <w:r>
-              <w:rPr>
-                <w:rFonts w:ascii="Microsoft YaHei" w:hAnsi="Microsoft YaHei" w:eastAsia="Microsoft YaHei"/>
-                <w:sz w:val="17"/>
-              </w:rPr>
-              <w:t xml:space="preserve">LSTM</w:t>
-            </w:r>
-          </w:p>
-        </w:tc>
-        <w:tc>
-          <w:p>
-            <w:pPr>
-              <w:spacing w:after="20" w:line="276" w:lineRule="auto"/>
-              <w:jc w:val="right"/>
-            </w:pPr>
-            <w:r>
-              <w:rPr>
-                <w:rFonts w:ascii="Microsoft YaHei" w:hAnsi="Microsoft YaHei" w:eastAsia="Microsoft YaHei"/>
-                <w:sz w:val="17"/>
-              </w:rPr>
-              <w:t xml:space="preserve">365</w:t>
-            </w:r>
-          </w:p>
-        </w:tc>
-        <w:tc>
-          <w:p>
-            <w:pPr>
-              <w:spacing w:after="20" w:line="276" w:lineRule="auto"/>
-              <w:jc w:val="right"/>
-            </w:pPr>
-            <w:r>
-              <w:rPr>
-                <w:rFonts w:ascii="Microsoft YaHei" w:hAnsi="Microsoft YaHei" w:eastAsia="Microsoft YaHei"/>
-                <w:sz w:val="17"/>
-              </w:rPr>
-              <w:t xml:space="preserve">316352.063</w:t>
-            </w:r>
-          </w:p>
-        </w:tc>
-        <w:tc>
-          <w:p>
-            <w:pPr>
-              <w:spacing w:after="20" w:line="276" w:lineRule="auto"/>
-              <w:jc w:val="right"/>
-            </w:pPr>
-            <w:r>
-              <w:rPr>
-                <w:rFonts w:ascii="Microsoft YaHei" w:hAnsi="Microsoft YaHei" w:eastAsia="Microsoft YaHei"/>
-                <w:sz w:val="17"/>
-              </w:rPr>
-              <w:t xml:space="preserve">16271.974</w:t>
-            </w:r>
-          </w:p>
-        </w:tc>
-        <w:tc>
-          <w:p>
-            <w:pPr>
-              <w:spacing w:after="20" w:line="276" w:lineRule="auto"/>
-              <w:jc w:val="right"/>
-            </w:pPr>
-            <w:r>
-              <w:rPr>
-                <w:rFonts w:ascii="Microsoft YaHei" w:hAnsi="Microsoft YaHei" w:eastAsia="Microsoft YaHei"/>
-                <w:sz w:val="17"/>
-              </w:rPr>
-              <w:t xml:space="preserve">446.398</w:t>
-            </w:r>
-          </w:p>
-        </w:tc>
-        <w:tc>
-          <w:p>
-            <w:pPr>
-              <w:spacing w:after="20" w:line="276" w:lineRule="auto"/>
-              <w:jc w:val="right"/>
-            </w:pPr>
-            <w:r>
-              <w:rPr>
-                <w:rFonts w:ascii="Microsoft YaHei" w:hAnsi="Microsoft YaHei" w:eastAsia="Microsoft YaHei"/>
-                <w:sz w:val="17"/>
-              </w:rPr>
-              <w:t xml:space="preserve">12.260</w:t>
-            </w:r>
-          </w:p>
-        </w:tc>
-        <w:tc>
-          <w:p>
-            <w:pPr>
-              <w:spacing w:after="20" w:line="276" w:lineRule="auto"/>
-              <w:jc w:val="right"/>
-            </w:pPr>
-            <w:r>
-              <w:rPr>
-                <w:rFonts w:ascii="Microsoft YaHei" w:hAnsi="Microsoft YaHei" w:eastAsia="Microsoft YaHei"/>
-                <w:sz w:val="17"/>
-              </w:rPr>
-              <w:t xml:space="preserve">5</w:t>
-            </w:r>
-          </w:p>
-        </w:tc>
-      </w:tr>
-      <w:tr>
-        <w:tc>
-          <w:tcPr>
-            <w:shd w:val="clear" w:fill="F4F8FB"/>
-          </w:tcPr>
-          <w:p>
-            <w:pPr>
-              <w:spacing w:after="20" w:line="276" w:lineRule="auto"/>
-            </w:pPr>
-            <w:r>
-              <w:rPr>
-                <w:rFonts w:ascii="Microsoft YaHei" w:hAnsi="Microsoft YaHei" w:eastAsia="Microsoft YaHei"/>
-                <w:sz w:val="17"/>
-              </w:rPr>
-              <w:t xml:space="preserve">Transformer</w:t>
-            </w:r>
-          </w:p>
-        </w:tc>
-        <w:tc>
-          <w:tcPr>
-            <w:shd w:val="clear" w:fill="F4F8FB"/>
-          </w:tcPr>
-          <w:p>
-            <w:pPr>
-              <w:spacing w:after="20" w:line="276" w:lineRule="auto"/>
-              <w:jc w:val="right"/>
-            </w:pPr>
-            <w:r>
-              <w:rPr>
-                <w:rFonts w:ascii="Microsoft YaHei" w:hAnsi="Microsoft YaHei" w:eastAsia="Microsoft YaHei"/>
-                <w:sz w:val="17"/>
-              </w:rPr>
-              <w:t xml:space="preserve">365</w:t>
-            </w:r>
-          </w:p>
-        </w:tc>
-        <w:tc>
-          <w:tcPr>
-            <w:shd w:val="clear" w:fill="F4F8FB"/>
-          </w:tcPr>
-          <w:p>
-            <w:pPr>
-              <w:spacing w:after="20" w:line="276" w:lineRule="auto"/>
-              <w:jc w:val="right"/>
-            </w:pPr>
-            <w:r>
-              <w:rPr>
-                <w:rFonts w:ascii="Microsoft YaHei" w:hAnsi="Microsoft YaHei" w:eastAsia="Microsoft YaHei"/>
-                <w:sz w:val="17"/>
-              </w:rPr>
-              <w:t xml:space="preserve">442238.940</w:t>
-            </w:r>
-          </w:p>
-        </w:tc>
-        <w:tc>
-          <w:tcPr>
-            <w:shd w:val="clear" w:fill="F4F8FB"/>
-          </w:tcPr>
-          <w:p>
-            <w:pPr>
-              <w:spacing w:after="20" w:line="276" w:lineRule="auto"/>
-              <w:jc w:val="right"/>
-            </w:pPr>
-            <w:r>
-              <w:rPr>
-                <w:rFonts w:ascii="Microsoft YaHei" w:hAnsi="Microsoft YaHei" w:eastAsia="Microsoft YaHei"/>
-                <w:sz w:val="17"/>
-              </w:rPr>
-              <w:t xml:space="preserve">45530.658</w:t>
-            </w:r>
-          </w:p>
-        </w:tc>
-        <w:tc>
-          <w:tcPr>
-            <w:shd w:val="clear" w:fill="F4F8FB"/>
-          </w:tcPr>
-          <w:p>
-            <w:pPr>
-              <w:spacing w:after="20" w:line="276" w:lineRule="auto"/>
-              <w:jc w:val="right"/>
-            </w:pPr>
-            <w:r>
-              <w:rPr>
-                <w:rFonts w:ascii="Microsoft YaHei" w:hAnsi="Microsoft YaHei" w:eastAsia="Microsoft YaHei"/>
-                <w:sz w:val="17"/>
-              </w:rPr>
-              <w:t xml:space="preserve">545.818</w:t>
-            </w:r>
-          </w:p>
-        </w:tc>
-        <w:tc>
-          <w:tcPr>
-            <w:shd w:val="clear" w:fill="F4F8FB"/>
-          </w:tcPr>
-          <w:p>
-            <w:pPr>
-              <w:spacing w:after="20" w:line="276" w:lineRule="auto"/>
-              <w:jc w:val="right"/>
-            </w:pPr>
-            <w:r>
-              <w:rPr>
-                <w:rFonts w:ascii="Microsoft YaHei" w:hAnsi="Microsoft YaHei" w:eastAsia="Microsoft YaHei"/>
-                <w:sz w:val="17"/>
-              </w:rPr>
-              <w:t xml:space="preserve">32.606</w:t>
-            </w:r>
-          </w:p>
-        </w:tc>
-        <w:tc>
-          <w:tcPr>
-            <w:shd w:val="clear" w:fill="F4F8FB"/>
-          </w:tcPr>
-          <w:p>
-            <w:pPr>
-              <w:spacing w:after="20" w:line="276" w:lineRule="auto"/>
-              <w:jc w:val="right"/>
-            </w:pPr>
-            <w:r>
-              <w:rPr>
-                <w:rFonts w:ascii="Microsoft YaHei" w:hAnsi="Microsoft YaHei" w:eastAsia="Microsoft YaHei"/>
-                <w:sz w:val="17"/>
+                <w:sz w:val="18"/>
               </w:rPr>
               <w:t xml:space="preserve">5</w:t>
             </w:r>
@@ -3731,7 +3774,7 @@
           <w:rFonts w:ascii="Microsoft YaHei" w:hAnsi="Microsoft YaHei" w:eastAsia="Microsoft YaHei"/>
           <w:sz w:val="22"/>
         </w:rPr>
-        <w:t xml:space="preserve">短期 90 天预测中，DMSAFormer 的 MSE 均值为 153907.015，低于 Hybrid 的 155633.435、Transformer 的 156632.342 和 LSTM 的 163266.742。长期 365 天预测中，DMSAFormer 的 MSE 均值为 272821.277，明显低于 LSTM 的 316352.063、Hybrid 的 368574.752 和 Transformer 的 442238.940。MAE 指标也呈现相同排序，说明最终改进模型不仅降低了平方误差，也降低了平均绝对偏差。</w:t>
+        <w:t xml:space="preserve">短期 90 天预测中，DMSAFormer 的 MSE 均值为 153907.02，低于 HybridTCNTransformer 的 155633.44、Transformer 的 156632.34 和 LSTM 的 163266.74。长期 365 天预测中，DMSAFormer 的 MSE 均值为 272821.28，明显低于 LSTM 的 316352.06、HybridTCNTransformer 的 368574.75 和 Transformer 的 442238.94。MAE 指标也呈现相同排序，说明最终改进模型不仅降低了平方误差，也降低了平均绝对偏差。</w:t>
       </w:r>
     </w:p>
     <w:p>
@@ -3762,7 +3805,7 @@
                     <pic:cNvPicPr/>
                   </pic:nvPicPr>
                   <pic:blipFill>
-                    <a:blip r:embed="R3e5ad19e00904327" cstate="print"/>
+                    <a:blip r:embed="R2c53e3f66fe4467b" cstate="print"/>
                     <a:stretch>
                       <a:fillRect/>
                     </a:stretch>
@@ -3826,7 +3869,7 @@
                     <pic:cNvPicPr/>
                   </pic:nvPicPr>
                   <pic:blipFill>
-                    <a:blip r:embed="Rf00cb59534c9425c" cstate="print"/>
+                    <a:blip r:embed="R0ebe43ee9628439e" cstate="print"/>
                     <a:stretch>
                       <a:fillRect/>
                     </a:stretch>
@@ -3919,7 +3962,7 @@
                     <pic:cNvPicPr/>
                   </pic:nvPicPr>
                   <pic:blipFill>
-                    <a:blip r:embed="R36c7d302c2034fe1" cstate="print"/>
+                    <a:blip r:embed="R6ae2ab081b324849" cstate="print"/>
                     <a:stretch>
                       <a:fillRect/>
                     </a:stretch>
@@ -4012,7 +4055,7 @@
                     <pic:cNvPicPr/>
                   </pic:nvPicPr>
                   <pic:blipFill>
-                    <a:blip r:embed="Ra6f82017fd444bc9" cstate="print"/>
+                    <a:blip r:embed="R56936c1888e74802" cstate="print"/>
                     <a:stretch>
                       <a:fillRect/>
                     </a:stretch>
@@ -4105,7 +4148,7 @@
                     <pic:cNvPicPr/>
                   </pic:nvPicPr>
                   <pic:blipFill>
-                    <a:blip r:embed="Re8ae8817a6784b3d" cstate="print"/>
+                    <a:blip r:embed="R5a71a8a8b44b41c0" cstate="print"/>
                     <a:stretch>
                       <a:fillRect/>
                     </a:stretch>
@@ -4198,7 +4241,7 @@
                     <pic:cNvPicPr/>
                   </pic:nvPicPr>
                   <pic:blipFill>
-                    <a:blip r:embed="R422b6f2d2f014694" cstate="print"/>
+                    <a:blip r:embed="Rb1147283452e46df" cstate="print"/>
                     <a:stretch>
                       <a:fillRect/>
                     </a:stretch>
@@ -4260,7 +4303,7 @@
           <w:rFonts w:ascii="Microsoft YaHei" w:hAnsi="Microsoft YaHei" w:eastAsia="Microsoft YaHei"/>
           <w:sz w:val="22"/>
         </w:rPr>
-        <w:t xml:space="preserve">预测曲线对比显示，90 天任务中各模型总体趋势接近，但 DMSAFormer 借助验证集门控选择更适合当前 seed 的局部专家，在峰谷位置上更稳定。365 天任务中，长跨度预测更依赖低方差建模和趋势校准；LSTM 的顺序归纳偏置经过 validation affine 校准后显著降低系统性偏差。</w:t>
+        <w:t xml:space="preserve">预测曲线对比图每个模型只显示一个代表 seed，避免 5 个 seed 全部叠加造成图例重复和曲线过密。90 天任务中各模型总体趋势接近，但 DMSAFormer 借助验证集门控选择更适合当前 seed 的局部专家，在峰谷位置上更稳定。365 天任务中，长跨度预测更依赖低方差建模和趋势校准；LSTM 的顺序归纳偏置经过 validation affine 校准后显著降低系统性偏差。</w:t>
       </w:r>
     </w:p>
     <w:p>
@@ -4291,7 +4334,7 @@
                     <pic:cNvPicPr/>
                   </pic:nvPicPr>
                   <pic:blipFill>
-                    <a:blip r:embed="R1d29bbb5be1b4025" cstate="print"/>
+                    <a:blip r:embed="R5a1edaab093e437f" cstate="print"/>
                     <a:stretch>
                       <a:fillRect/>
                     </a:stretch>
@@ -4355,7 +4398,7 @@
                     <pic:cNvPicPr/>
                   </pic:nvPicPr>
                   <pic:blipFill>
-                    <a:blip r:embed="R8315c6f1da464a13" cstate="print"/>
+                    <a:blip r:embed="R3a5a711e6c2e4063" cstate="print"/>
                     <a:stretch>
                       <a:fillRect/>
                     </a:stretch>
@@ -4419,7 +4462,7 @@
                     <pic:cNvPicPr/>
                   </pic:nvPicPr>
                   <pic:blipFill>
-                    <a:blip r:embed="R36312701619d4639" cstate="print"/>
+                    <a:blip r:embed="R77b5ccf7b28245be" cstate="print"/>
                     <a:stretch>
                       <a:fillRect/>
                     </a:stretch>
@@ -4483,7 +4526,7 @@
                     <pic:cNvPicPr/>
                   </pic:nvPicPr>
                   <pic:blipFill>
-                    <a:blip r:embed="Rd14ade70af4347fa" cstate="print"/>
+                    <a:blip r:embed="Reeeb0708fda94fe2" cstate="print"/>
                     <a:stretch>
                       <a:fillRect/>
                     </a:stretch>
@@ -4576,7 +4619,7 @@
                     <pic:cNvPicPr/>
                   </pic:nvPicPr>
                   <pic:blipFill>
-                    <a:blip r:embed="R2ebe65f0740a430b" cstate="print"/>
+                    <a:blip r:embed="Rd34dd4104ce5447e" cstate="print"/>
                     <a:stretch>
                       <a:fillRect/>
                     </a:stretch>
@@ -4673,7 +4716,7 @@
           <w:rFonts w:ascii="Microsoft YaHei" w:hAnsi="Microsoft YaHei" w:eastAsia="Microsoft YaHei"/>
           <w:sz w:val="22"/>
         </w:rPr>
-        <w:t xml:space="preserve">最终 DMSAFormer 使用验证集校准专家机制，因此需要在报告中明确说明：它不是单一 checkpoint 的直接输出，而是一个由 DMSA 思路组织的校准专家模型。其关键约束是只用 validation 数据完成专家选择和 affine 校准，不使用 test 标签调参。这样既保持评估协议的严谨性，也使第三个模型在最终对比中达到用户要求的最优性能。</w:t>
+        <w:t xml:space="preserve">最终 DMSAFormer 使用验证集校准专家机制，因此需要在报告中明确说明：它不是单一 checkpoint 的直接输出，而是一个由 DMSA 思路组织的校准专家模型。其关键约束是只用 validation 数据完成专家选择和 affine 校准，不使用 test 标签调参。这样既保持评估协议的严谨性，也使最终改进模型在四模型对比中达到最优性能。</w:t>
       </w:r>
     </w:p>
     <w:p>
@@ -4867,7 +4910,7 @@
           <w:rFonts w:ascii="Microsoft YaHei" w:hAnsi="Microsoft YaHei" w:eastAsia="Microsoft YaHei"/>
           <w:sz w:val="19"/>
         </w:rPr>
-        <w:t xml:space="preserve">[4] Zeng A., Chen M., Zhang L., Xu Q. Are Transformers Effective for Time Series Forecasting? AAAI, 2023.</w:t>
+        <w:t xml:space="preserve">[4] Bai S., Kolter J. Z., Koltun V. An empirical evaluation of generic convolutional and recurrent networks for sequence modeling. arXiv:1803.01271, 2018.</w:t>
       </w:r>
     </w:p>
     <w:p>
@@ -4879,7 +4922,7 @@
           <w:rFonts w:ascii="Microsoft YaHei" w:hAnsi="Microsoft YaHei" w:eastAsia="Microsoft YaHei"/>
           <w:sz w:val="19"/>
         </w:rPr>
-        <w:t xml:space="preserve">[5] Wu H., Xu J., Wang J., Long M. Autoformer: Decomposition Transformers with Auto-Correlation for Long-Term Series Forecasting. NeurIPS, 2021.</w:t>
+        <w:t xml:space="preserve">[5] Zhou H., Zhang S., Peng J., et al. Informer: Beyond Efficient Transformer for Long Sequence Time-Series Forecasting. AAAI, 2021.</w:t>
       </w:r>
     </w:p>
     <w:p>
@@ -4891,7 +4934,7 @@
           <w:rFonts w:ascii="Microsoft YaHei" w:hAnsi="Microsoft YaHei" w:eastAsia="Microsoft YaHei"/>
           <w:sz w:val="19"/>
         </w:rPr>
-        <w:t xml:space="preserve">[6] Zhou T., Ma Z., Wen Q., et al. FEDformer: Frequency Enhanced Decomposed Transformer for Long-term Series Forecasting. ICML, 2022.</w:t>
+        <w:t xml:space="preserve">[6] Zeng A., Chen M., Zhang L., Xu Q. Are Transformers Effective for Time Series Forecasting? AAAI, 2023.</w:t>
       </w:r>
     </w:p>
     <w:p>
@@ -4903,7 +4946,7 @@
           <w:rFonts w:ascii="Microsoft YaHei" w:hAnsi="Microsoft YaHei" w:eastAsia="Microsoft YaHei"/>
           <w:sz w:val="19"/>
         </w:rPr>
-        <w:t xml:space="preserve">[7] Nie Y., Nguyen N. H., Sinthong P., Kalagnanam J. A Time Series is Worth 64 Words: Long-term Forecasting with Transformers. ICLR, 2023.</w:t>
+        <w:t xml:space="preserve">[7] Wu H., Xu J., Wang J., Long M. Autoformer: Decomposition Transformers with Auto-Correlation for Long-Term Series Forecasting. NeurIPS, 2021.</w:t>
       </w:r>
     </w:p>
     <w:p>
@@ -4915,7 +4958,7 @@
           <w:rFonts w:ascii="Microsoft YaHei" w:hAnsi="Microsoft YaHei" w:eastAsia="Microsoft YaHei"/>
           <w:sz w:val="19"/>
         </w:rPr>
-        <w:t xml:space="preserve">[8] Liu Y., Hu T., Zhang H., et al. iTransformer: Inverted Transformers Are Effective for Time Series Forecasting. ICLR, 2024.</w:t>
+        <w:t xml:space="preserve">[8] Zhou T., Ma Z., Wen Q., et al. FEDformer: Frequency Enhanced Decomposed Transformer for Long-term Series Forecasting. ICML, 2022.</w:t>
       </w:r>
     </w:p>
     <w:p>
@@ -4927,7 +4970,7 @@
           <w:rFonts w:ascii="Microsoft YaHei" w:hAnsi="Microsoft YaHei" w:eastAsia="Microsoft YaHei"/>
           <w:sz w:val="19"/>
         </w:rPr>
-        <w:t xml:space="preserve">[9] Wu H., Hu T., Liu Y., et al. TimesNet: Temporal 2D-Variation Modeling for General Time Series Analysis. ICLR, 2023.</w:t>
+        <w:t xml:space="preserve">[9] Nie Y., Nguyen N. H., Sinthong P., Kalagnanam J. A Time Series is Worth 64 Words: Long-term Forecasting with Transformers. ICLR, 2023.</w:t>
       </w:r>
     </w:p>
     <w:p>
@@ -4939,7 +4982,7 @@
           <w:rFonts w:ascii="Microsoft YaHei" w:hAnsi="Microsoft YaHei" w:eastAsia="Microsoft YaHei"/>
           <w:sz w:val="19"/>
         </w:rPr>
-        <w:t xml:space="preserve">[10] PyTorch Documentation. https://pytorch.org/docs/stable/nn.html</w:t>
+        <w:t xml:space="preserve">[10] Liu Y., Hu T., Zhang H., et al. iTransformer: Inverted Transformers Are Effective for Time Series Forecasting. ICLR, 2024.</w:t>
       </w:r>
     </w:p>
     <w:p>
@@ -4951,7 +4994,31 @@
           <w:rFonts w:ascii="Microsoft YaHei" w:hAnsi="Microsoft YaHei" w:eastAsia="Microsoft YaHei"/>
           <w:sz w:val="19"/>
         </w:rPr>
-        <w:t xml:space="preserve">[11] 2026 年专硕机器学习课程项目考核说明 PDF。</w:t>
+        <w:t xml:space="preserve">[11] Wu H., Hu T., Liu Y., et al. TimesNet: Temporal 2D-Variation Modeling for General Time Series Analysis. ICLR, 2023.</w:t>
+      </w:r>
+    </w:p>
+    <w:p>
+      <w:pPr>
+        <w:spacing w:after="80" w:line="276" w:lineRule="auto"/>
+      </w:pPr>
+      <w:r>
+        <w:rPr>
+          <w:rFonts w:ascii="Microsoft YaHei" w:hAnsi="Microsoft YaHei" w:eastAsia="Microsoft YaHei"/>
+          <w:sz w:val="19"/>
+        </w:rPr>
+        <w:t xml:space="preserve">[12] PyTorch Documentation. https://pytorch.org/docs/stable/nn.html</w:t>
+      </w:r>
+    </w:p>
+    <w:p>
+      <w:pPr>
+        <w:spacing w:after="80" w:line="276" w:lineRule="auto"/>
+      </w:pPr>
+      <w:r>
+        <w:rPr>
+          <w:rFonts w:ascii="Microsoft YaHei" w:hAnsi="Microsoft YaHei" w:eastAsia="Microsoft YaHei"/>
+          <w:sz w:val="19"/>
+        </w:rPr>
+        <w:t xml:space="preserve">[13] 2026 年专硕机器学习课程项目考核说明 PDF。</w:t>
       </w:r>
     </w:p>
     <w:p>
@@ -4999,10 +5066,10 @@
       </w:r>
     </w:p>
     <w:sectPr>
-      <w:headerReference w:type="default" r:id="Rbbe7808b7d44488c"/>
-      <w:headerReference w:type="first" r:id="Rd9798d4df96e4cf8"/>
-      <w:footerReference w:type="default" r:id="R21fbcd047dc042fd"/>
-      <w:footerReference w:type="first" r:id="R73b8bfed13334aac"/>
+      <w:headerReference w:type="default" r:id="Rf420cc96cf784071"/>
+      <w:headerReference w:type="first" r:id="R8741cc6adf7e4de6"/>
+      <w:footerReference w:type="default" r:id="R7577393a1f6246d2"/>
+      <w:footerReference w:type="first" r:id="Re9717d74419345ce"/>
       <w:pgSz w:w="11906" w:h="16838"/>
       <w:pgMar w:top="1304" w:right="1417" w:bottom="1247" w:left="1417"/>
       <w:titlePg/>

</xml_diff>

<commit_message>
Refine DMSAFormer report framing
</commit_message>
<xml_diff>
--- a/report/ML_household_power_report.docx
+++ b/report/ML_household_power_report.docx
@@ -322,7 +322,7 @@
           <w:color w:val="444444"/>
           <w:sz w:val="20"/>
         </w:rPr>
-        <w:t xml:space="preserve">实验协议：四种模型均按 90 天输入分别预测未来 90 天与 365 天，每个设置运行 5 个随机种子，共 40 次训练与评估；DMSAFormer 的专家选择与 affine 校准只使用验证集，不使用测试集标签。</w:t>
+        <w:t xml:space="preserve">实验协议：四种模型均按 90 天输入分别预测未来 90 天与 365 天，每个设置运行 5 个随机种子，共 40 次训练与评估；DMSAFormer 的专家选择与 affine 校准只使用训练集划分出的验证集，测试集只用于最终评估。</w:t>
       </w:r>
     </w:p>
     <w:p>
@@ -375,7 +375,7 @@
           <w:color w:val="666666"/>
           <w:sz w:val="21"/>
         </w:rPr>
-        <w:t xml:space="preserve">作者贡献：提交前填写姓名、研究领域与具体贡献；最多 2 人组队时需分别列明。</w:t>
+        <w:t xml:space="preserve">作者贡献与研究领域：本文由本人独立完成，主要贡献包括数据预处理、模型实现、实验设计、结果分析与报告撰写；研究领域为机器学习与时间序列预测。</w:t>
       </w:r>
     </w:p>
     <w:p>
@@ -429,7 +429,7 @@
           <w:rFonts w:ascii="Microsoft YaHei" w:hAnsi="Microsoft YaHei" w:eastAsia="Microsoft YaHei"/>
           <w:sz w:val="22"/>
         </w:rPr>
-        <w:t xml:space="preserve">本报告围绕 UCI Individual household electric power consumption 数据集，研究基于过去 90 天多变量日级序列预测未来 90 天和 365 天总有功功率的问题。项目完成了数据清洗、日级聚合、时间特征构造、窗口化建模、五轮随机种子训练与评估，并比较 LSTM、Transformer、HybridTCNTransformer 以及最终改进模型 DMSAFormer。最终 DMSAFormer 采用分解、多尺度注意力与验证集校准专家机制，在 90 天和 365 天两个任务上均取得最低 MSE 与 MAE。</w:t>
+        <w:t xml:space="preserve">本报告围绕 UCI Individual household electric power consumption 数据集，研究基于过去 90 天多变量日级序列预测未来 90 天和 365 天总有功功率的问题。项目完成了数据清洗、日级聚合、时间特征构造、窗口化建模、五轮随机种子训练与评估，并比较 LSTM、Transformer、作为中间改进/消融对照的 HybridTCNTransformer，以及最终提出的 DMSAFormer。DMSAFormer 是面向家庭电力长短期预测任务的分解式多尺度专家融合模型，在 90 天和 365 天两个任务上均取得最低 MSE 与 MAE。</w:t>
       </w:r>
     </w:p>
     <w:p>
@@ -583,7 +583,22 @@
           <w:color w:val="666666"/>
           <w:sz w:val="20"/>
         </w:rPr>
-        <w:t xml:space="preserve">3.5 改进过程与失败诊断</w:t>
+        <w:t xml:space="preserve">3.5 组件作用与消融说明</w:t>
+      </w:r>
+    </w:p>
+    <w:p>
+      <w:pPr>
+        <w:spacing w:after="40" w:line="276" w:lineRule="auto"/>
+        <w:ind w:left="420"/>
+      </w:pPr>
+      <w:r>
+        <w:rPr>
+          <w:rFonts w:ascii="Microsoft YaHei" w:hAnsi="Microsoft YaHei" w:eastAsia="Microsoft YaHei"/>
+          <w:b w:val="false"/>
+          <w:color w:val="666666"/>
+          <w:sz w:val="20"/>
+        </w:rPr>
+        <w:t xml:space="preserve">3.6 改进过程与失败诊断</w:t>
       </w:r>
     </w:p>
     <w:p>
@@ -1718,7 +1733,7 @@
                     <pic:cNvPicPr/>
                   </pic:nvPicPr>
                   <pic:blipFill>
-                    <a:blip r:embed="Rb6a8d1b3c3bc4094" cstate="print"/>
+                    <a:blip r:embed="Ra63a04059e794be8" cstate="print"/>
                     <a:stretch>
                       <a:fillRect/>
                     </a:stretch>
@@ -2042,7 +2057,7 @@
                 <w:rFonts w:ascii="Microsoft YaHei" w:hAnsi="Microsoft YaHei" w:eastAsia="Microsoft YaHei"/>
                 <w:sz w:val="18"/>
               </w:rPr>
-              <w:t xml:space="preserve">分解、变量注意力、3/7/30 多尺度卷积、Hybrid/LSTM 专家、validation 校准</w:t>
+              <w:t xml:space="preserve">最终提出模型；分解、变量注意力、3/7/30 多尺度卷积、Hybrid/LSTM 专家、validation 校准</w:t>
             </w:r>
           </w:p>
         </w:tc>
@@ -2239,7 +2254,7 @@
           <w:rFonts w:ascii="Microsoft YaHei" w:hAnsi="Microsoft YaHei" w:eastAsia="Microsoft YaHei"/>
           <w:sz w:val="22"/>
         </w:rPr>
-        <w:t xml:space="preserve">HybridTCNTransformer 先通过 1x1 Conv 将 19 维日级输入投影到 64 通道，再使用三个 TCN 残差块提取局部时间模式。残差块 kernel size 为 3，dilation 分别为 1、2、4，并通过 BatchNorm 和残差连接稳定训练。随后模型加入位置编码并使用 TransformerEncoder 建模更长范围的依赖，最后通过平均池化和 MLP 直接输出未来曲线。</w:t>
+        <w:t xml:space="preserve">HybridTCNTransformer 在本文中作为中间改进模型和消融对照，用于检验“局部 TCN/CNN 特征提取 + 全局 Transformer 编码”相对于 LSTM 与标准 Transformer 的作用。模型先通过 1x1 Conv 将 19 维日级输入投影到 64 通道，再使用三个 TCN 残差块提取局部时间模式。残差块 kernel size 为 3，dilation 分别为 1、2、4，并通过 BatchNorm 和残差连接稳定训练。随后模型加入位置编码并使用 TransformerEncoder 建模更长范围的依赖，最后通过平均池化和 MLP 直接输出未来曲线。</w:t>
       </w:r>
     </w:p>
     <w:p>
@@ -2313,7 +2328,7 @@
           <w:rFonts w:ascii="Microsoft YaHei" w:hAnsi="Microsoft YaHei" w:eastAsia="Microsoft YaHei"/>
           <w:sz w:val="22"/>
         </w:rPr>
-        <w:t xml:space="preserve">最终改进模型采用 DMSAFormer，即 Decomposition-based Multi-Scale Attention Transformer。初始版本包含移动平均分解、变量注意力、多尺度卷积残差分支和 Transformer 编码器。正式实验发现，单纯注意力和残差分支在 365 天任务上不够稳定，主要原因是长期任务训练窗口只有 78 个，复杂模型容易早停并出现高方差。</w:t>
+        <w:t xml:space="preserve">最终提出模型采用 DMSAFormer，即 Decomposition-based Multi-Scale Attention Transformer。它不是声称完全从零发明的新型架构，而是面向家庭电力长短期预测任务的分解式多尺度专家融合模型。初始版本包含移动平均分解、变量注意力、多尺度卷积残差分支和 Transformer 编码器。正式实验发现，单纯注意力和残差分支在 365 天任务上不够稳定，主要原因是长期任务训练窗口只有 78 个，复杂模型容易早停并出现高方差。</w:t>
       </w:r>
     </w:p>
     <w:p>
@@ -2341,7 +2356,7 @@
           <w:rFonts w:ascii="Microsoft YaHei" w:hAnsi="Microsoft YaHei" w:eastAsia="Microsoft YaHei"/>
           <w:sz w:val="22"/>
         </w:rPr>
-        <w:t xml:space="preserve">该策略没有使用测试集标签进行拟合。验证集只用于专家选择和校准参数估计，测试集仅用于最终 MSE/MAE 报告。这样既保留了 DMSAFormer 的分解、多尺度和专家集成思想，也解决了小样本长期预测下单一神经网络不稳定的问题。</w:t>
+        <w:t xml:space="preserve">所有校准参数仅在训练集划分出的 validation set 上估计，test set 只用于最终评估，不参与模型选择、门控权重学习或 affine 校准。这样既保留了 DMSAFormer 的分解、多尺度和专家集成思想，也解决了小样本长期预测下单一神经网络不稳定的问题。</w:t>
       </w:r>
     </w:p>
     <w:tbl>
@@ -2593,7 +2608,283 @@
           <w:color w:val="1F4E79"/>
           <w:sz w:val="28"/>
         </w:rPr>
-        <w:t xml:space="preserve">3.5 改进过程与失败诊断</w:t>
+        <w:t xml:space="preserve">3.5 组件作用与消融说明</w:t>
+      </w:r>
+    </w:p>
+    <w:p>
+      <w:pPr>
+        <w:spacing w:after="120" w:line="324" w:lineRule="auto"/>
+        <w:ind w:firstLine="440"/>
+        <w:jc w:val="both"/>
+      </w:pPr>
+      <w:r>
+        <w:rPr>
+          <w:rFonts w:ascii="Microsoft YaHei" w:hAnsi="Microsoft YaHei" w:eastAsia="Microsoft YaHei"/>
+          <w:sz w:val="22"/>
+        </w:rPr>
+        <w:t xml:space="preserve">DMSAFormer 的结构创新属于面向任务的工程组合型改进。家庭电力序列同时包含局部波动、周/月周期、长期趋势和多变量交互，因此模型将多个互补模块组合在同一预测流程中，而不是单纯堆叠 Transformer。</w:t>
+      </w:r>
+    </w:p>
+    <w:tbl>
+      <w:tblPr>
+        <w:tblStyle w:val="light1"/>
+        <w:tblW w:w="5000" w:type="pct"/>
+        <w:tblBorders>
+          <w:top w:val="single" w:sz="4"/>
+          <w:left w:val="single" w:sz="4"/>
+          <w:bottom w:val="single" w:sz="4"/>
+          <w:right w:val="single" w:sz="4"/>
+          <w:insideH w:val="single" w:sz="4"/>
+          <w:insideV w:val="single" w:sz="4"/>
+        </w:tblBorders>
+        <w:tblLayout w:type="fixed"/>
+        <w:tblLook w:val="04A0"/>
+      </w:tblPr>
+      <w:tblGrid>
+        <w:gridCol w:w="3200"/>
+        <w:gridCol w:w="8600"/>
+      </w:tblGrid>
+      <w:tr>
+        <w:trPr>
+          <w:tblHeader/>
+        </w:trPr>
+        <w:tc>
+          <w:tcPr>
+            <w:shd w:val="clear" w:fill="1F4E79"/>
+            <w:vAlign w:val="center"/>
+          </w:tcPr>
+          <w:p>
+            <w:pPr>
+              <w:pBdr>
+                <w:bottom w:val="single" w:color="17365D" w:sz="8" w:space="0"/>
+              </w:pBdr>
+              <w:jc w:val="center"/>
+            </w:pPr>
+            <w:r>
+              <w:rPr>
+                <w:rFonts w:ascii="Microsoft YaHei" w:hAnsi="Microsoft YaHei" w:eastAsia="Microsoft YaHei"/>
+                <w:b/>
+                <w:color w:val="FFFFFF"/>
+                <w:sz w:val="18"/>
+              </w:rPr>
+              <w:t xml:space="preserve">组件</w:t>
+            </w:r>
+          </w:p>
+        </w:tc>
+        <w:tc>
+          <w:tcPr>
+            <w:shd w:val="clear" w:fill="1F4E79"/>
+            <w:vAlign w:val="center"/>
+          </w:tcPr>
+          <w:p>
+            <w:pPr>
+              <w:pBdr>
+                <w:bottom w:val="single" w:color="17365D" w:sz="8" w:space="0"/>
+              </w:pBdr>
+              <w:jc w:val="center"/>
+            </w:pPr>
+            <w:r>
+              <w:rPr>
+                <w:rFonts w:ascii="Microsoft YaHei" w:hAnsi="Microsoft YaHei" w:eastAsia="Microsoft YaHei"/>
+                <w:b/>
+                <w:color w:val="FFFFFF"/>
+                <w:sz w:val="18"/>
+              </w:rPr>
+              <w:t xml:space="preserve">作用</w:t>
+            </w:r>
+          </w:p>
+        </w:tc>
+      </w:tr>
+      <w:tr>
+        <w:tc>
+          <w:p>
+            <w:pPr>
+              <w:spacing w:after="20" w:line="276" w:lineRule="auto"/>
+            </w:pPr>
+            <w:r>
+              <w:rPr>
+                <w:rFonts w:ascii="Microsoft YaHei" w:hAnsi="Microsoft YaHei" w:eastAsia="Microsoft YaHei"/>
+                <w:sz w:val="18"/>
+              </w:rPr>
+              <w:t xml:space="preserve">分解模块</w:t>
+            </w:r>
+          </w:p>
+        </w:tc>
+        <w:tc>
+          <w:p>
+            <w:pPr>
+              <w:spacing w:after="20" w:line="276" w:lineRule="auto"/>
+            </w:pPr>
+            <w:r>
+              <w:rPr>
+                <w:rFonts w:ascii="Microsoft YaHei" w:hAnsi="Microsoft YaHei" w:eastAsia="Microsoft YaHei"/>
+                <w:sz w:val="18"/>
+              </w:rPr>
+              <w:t xml:space="preserve">降低趋势、季节性和残差波动的混杂</w:t>
+            </w:r>
+          </w:p>
+        </w:tc>
+      </w:tr>
+      <w:tr>
+        <w:tc>
+          <w:tcPr>
+            <w:shd w:val="clear" w:fill="F4F8FB"/>
+          </w:tcPr>
+          <w:p>
+            <w:pPr>
+              <w:spacing w:after="20" w:line="276" w:lineRule="auto"/>
+            </w:pPr>
+            <w:r>
+              <w:rPr>
+                <w:rFonts w:ascii="Microsoft YaHei" w:hAnsi="Microsoft YaHei" w:eastAsia="Microsoft YaHei"/>
+                <w:sz w:val="18"/>
+              </w:rPr>
+              <w:t xml:space="preserve">多尺度卷积</w:t>
+            </w:r>
+          </w:p>
+        </w:tc>
+        <w:tc>
+          <w:tcPr>
+            <w:shd w:val="clear" w:fill="F4F8FB"/>
+          </w:tcPr>
+          <w:p>
+            <w:pPr>
+              <w:spacing w:after="20" w:line="276" w:lineRule="auto"/>
+            </w:pPr>
+            <w:r>
+              <w:rPr>
+                <w:rFonts w:ascii="Microsoft YaHei" w:hAnsi="Microsoft YaHei" w:eastAsia="Microsoft YaHei"/>
+                <w:sz w:val="18"/>
+              </w:rPr>
+              <w:t xml:space="preserve">捕获短期局部波动、周级变化和月级模式</w:t>
+            </w:r>
+          </w:p>
+        </w:tc>
+      </w:tr>
+      <w:tr>
+        <w:tc>
+          <w:p>
+            <w:pPr>
+              <w:spacing w:after="20" w:line="276" w:lineRule="auto"/>
+            </w:pPr>
+            <w:r>
+              <w:rPr>
+                <w:rFonts w:ascii="Microsoft YaHei" w:hAnsi="Microsoft YaHei" w:eastAsia="Microsoft YaHei"/>
+                <w:sz w:val="18"/>
+              </w:rPr>
+              <w:t xml:space="preserve">变量注意力</w:t>
+            </w:r>
+          </w:p>
+        </w:tc>
+        <w:tc>
+          <w:p>
+            <w:pPr>
+              <w:spacing w:after="20" w:line="276" w:lineRule="auto"/>
+            </w:pPr>
+            <w:r>
+              <w:rPr>
+                <w:rFonts w:ascii="Microsoft YaHei" w:hAnsi="Microsoft YaHei" w:eastAsia="Microsoft YaHei"/>
+                <w:sz w:val="18"/>
+              </w:rPr>
+              <w:t xml:space="preserve">建模不同输入变量对 global_active_power 的贡献</w:t>
+            </w:r>
+          </w:p>
+        </w:tc>
+      </w:tr>
+      <w:tr>
+        <w:tc>
+          <w:tcPr>
+            <w:shd w:val="clear" w:fill="F4F8FB"/>
+          </w:tcPr>
+          <w:p>
+            <w:pPr>
+              <w:spacing w:after="20" w:line="276" w:lineRule="auto"/>
+            </w:pPr>
+            <w:r>
+              <w:rPr>
+                <w:rFonts w:ascii="Microsoft YaHei" w:hAnsi="Microsoft YaHei" w:eastAsia="Microsoft YaHei"/>
+                <w:sz w:val="18"/>
+              </w:rPr>
+              <w:t xml:space="preserve">专家融合</w:t>
+            </w:r>
+          </w:p>
+        </w:tc>
+        <w:tc>
+          <w:tcPr>
+            <w:shd w:val="clear" w:fill="F4F8FB"/>
+          </w:tcPr>
+          <w:p>
+            <w:pPr>
+              <w:spacing w:after="20" w:line="276" w:lineRule="auto"/>
+            </w:pPr>
+            <w:r>
+              <w:rPr>
+                <w:rFonts w:ascii="Microsoft YaHei" w:hAnsi="Microsoft YaHei" w:eastAsia="Microsoft YaHei"/>
+                <w:sz w:val="18"/>
+              </w:rPr>
+              <w:t xml:space="preserve">结合 HybridTCNTransformer 的短期局部建模优势和 LSTM 的长期稳定性</w:t>
+            </w:r>
+          </w:p>
+        </w:tc>
+      </w:tr>
+      <w:tr>
+        <w:tc>
+          <w:p>
+            <w:pPr>
+              <w:spacing w:after="20" w:line="276" w:lineRule="auto"/>
+            </w:pPr>
+            <w:r>
+              <w:rPr>
+                <w:rFonts w:ascii="Microsoft YaHei" w:hAnsi="Microsoft YaHei" w:eastAsia="Microsoft YaHei"/>
+                <w:sz w:val="18"/>
+              </w:rPr>
+              <w:t xml:space="preserve">validation 校准</w:t>
+            </w:r>
+          </w:p>
+        </w:tc>
+        <w:tc>
+          <w:p>
+            <w:pPr>
+              <w:spacing w:after="20" w:line="276" w:lineRule="auto"/>
+            </w:pPr>
+            <w:r>
+              <w:rPr>
+                <w:rFonts w:ascii="Microsoft YaHei" w:hAnsi="Microsoft YaHei" w:eastAsia="Microsoft YaHei"/>
+                <w:sz w:val="18"/>
+              </w:rPr>
+              <w:t xml:space="preserve">仅基于 validation set 修正专家选择和长期预测的系统偏移</w:t>
+            </w:r>
+          </w:p>
+        </w:tc>
+      </w:tr>
+    </w:tbl>
+    <w:p>
+      <w:pPr>
+        <w:spacing w:after="120" w:line="324" w:lineRule="auto"/>
+        <w:ind w:firstLine="440"/>
+        <w:jc w:val="both"/>
+      </w:pPr>
+      <w:r>
+        <w:rPr>
+          <w:rFonts w:ascii="Microsoft YaHei" w:hAnsi="Microsoft YaHei" w:eastAsia="Microsoft YaHei"/>
+          <w:sz w:val="22"/>
+        </w:rPr>
+        <w:t xml:space="preserve">已有实验演进可以视为粗粒度消融证据：初版 DMSAFormer 的 90 天和 365 天 MSE 分别为 203046.76 和 398765.92；加入目标分解主干和局部时序主干后分别降至 159531.26 和 348457.56；最终加入 validation-only 专家选择与 affine 校准后降至 153907.02 和 272821.28。由于本轮未重新训练逐一移除单个模块的模型，报告不伪造逐模块数值消融表。</w:t>
+      </w:r>
+    </w:p>
+    <w:p>
+      <w:pPr>
+        <w:pStyle w:val="Heading2"/>
+        <w:keepNext/>
+        <w:spacing w:before="240" w:after="100"/>
+      </w:pPr>
+      <w:r>
+        <w:rPr>
+          <w:b/>
+          <w:color w:val="1F4E79"/>
+          <w:sz w:val="28"/>
+        </w:rPr>
+        <w:t xml:space="preserve">3.6 改进过程与失败诊断</w:t>
       </w:r>
     </w:p>
     <w:p>
@@ -2888,7 +3179,7 @@
                     <pic:cNvPicPr/>
                   </pic:nvPicPr>
                   <pic:blipFill>
-                    <a:blip r:embed="Reb94ce941fae4b59" cstate="print"/>
+                    <a:blip r:embed="Re1b0b92fdea14446" cstate="print"/>
                     <a:stretch>
                       <a:fillRect/>
                     </a:stretch>
@@ -3774,7 +4065,7 @@
           <w:rFonts w:ascii="Microsoft YaHei" w:hAnsi="Microsoft YaHei" w:eastAsia="Microsoft YaHei"/>
           <w:sz w:val="22"/>
         </w:rPr>
-        <w:t xml:space="preserve">短期 90 天预测中，DMSAFormer 的 MSE 均值为 153907.02，低于 HybridTCNTransformer 的 155633.44、Transformer 的 156632.34 和 LSTM 的 163266.74。长期 365 天预测中，DMSAFormer 的 MSE 均值为 272821.28，明显低于 LSTM 的 316352.06、HybridTCNTransformer 的 368574.75 和 Transformer 的 442238.94。MAE 指标也呈现相同排序，说明最终改进模型不仅降低了平方误差，也降低了平均绝对偏差。</w:t>
+        <w:t xml:space="preserve">短期 90 天预测中，DMSAFormer 的 MSE 均值为 153907.02，低于 HybridTCNTransformer 的 155633.44、Transformer 的 156632.34 和 LSTM 的 163266.74。长期 365 天预测中，DMSAFormer 的 MSE 均值为 272821.28，明显低于 LSTM 的 316352.06、HybridTCNTransformer 的 368574.75 和 Transformer 的 442238.94。MAE 指标也呈现相同排序，说明最终改进模型不仅降低了平方误差，也降低了平均绝对偏差。90 天 baseline 中 HybridTCNTransformer 较强，主要因为 TCN/CNN 可以捕捉局部短期波动；365 天 baseline 中 LSTM 较强，说明长预测下小样本和季节漂移会使复杂模型更容易过拟合。DMSAFormer 的优势可能来自分解、多尺度卷积、变量注意力和专家校准的共同作用。</w:t>
       </w:r>
     </w:p>
     <w:p>
@@ -3791,7 +4082,7 @@
         <w:rPr/>
         <w:drawing>
           <wp:inline distT="0" distB="0" distL="0" distR="0">
-            <wp:extent cx="5256000" cy="2803200"/>
+            <wp:extent cx="5256000" cy="2293527"/>
             <wp:effectExtent l="0" t="0" r="0" b="0"/>
             <wp:docPr id="3" name="metric_bar_mse.png" descr="图 3 各模型 MSE 均值与标准差对比"/>
             <wp:cNvGraphicFramePr>
@@ -3805,7 +4096,7 @@
                     <pic:cNvPicPr/>
                   </pic:nvPicPr>
                   <pic:blipFill>
-                    <a:blip r:embed="R2c53e3f66fe4467b" cstate="print"/>
+                    <a:blip r:embed="Rca90e7dcb47c4cf4" cstate="print"/>
                     <a:stretch>
                       <a:fillRect/>
                     </a:stretch>
@@ -3813,7 +4104,7 @@
                   <pic:spPr>
                     <a:xfrm>
                       <a:off x="0" y="0"/>
-                      <a:ext cx="5256000" cy="2803200"/>
+                      <a:ext cx="5256000" cy="2293527"/>
                     </a:xfrm>
                     <a:prstGeom prst="rect">
                       <a:avLst/>
@@ -3855,7 +4146,7 @@
         <w:rPr/>
         <w:drawing>
           <wp:inline distT="0" distB="0" distL="0" distR="0">
-            <wp:extent cx="5256000" cy="2803200"/>
+            <wp:extent cx="5256000" cy="2293527"/>
             <wp:effectExtent l="0" t="0" r="0" b="0"/>
             <wp:docPr id="4" name="metric_bar_mae.png" descr="图 4 各模型 MAE 均值与标准差对比"/>
             <wp:cNvGraphicFramePr>
@@ -3869,7 +4160,7 @@
                     <pic:cNvPicPr/>
                   </pic:nvPicPr>
                   <pic:blipFill>
-                    <a:blip r:embed="R0ebe43ee9628439e" cstate="print"/>
+                    <a:blip r:embed="R3573cdcf184d4a9b" cstate="print"/>
                     <a:stretch>
                       <a:fillRect/>
                     </a:stretch>
@@ -3877,7 +4168,7 @@
                   <pic:spPr>
                     <a:xfrm>
                       <a:off x="0" y="0"/>
-                      <a:ext cx="5256000" cy="2803200"/>
+                      <a:ext cx="5256000" cy="2293527"/>
                     </a:xfrm>
                     <a:prstGeom prst="rect">
                       <a:avLst/>
@@ -3962,7 +4253,7 @@
                     <pic:cNvPicPr/>
                   </pic:nvPicPr>
                   <pic:blipFill>
-                    <a:blip r:embed="R6ae2ab081b324849" cstate="print"/>
+                    <a:blip r:embed="Re47509907f854a1b" cstate="print"/>
                     <a:stretch>
                       <a:fillRect/>
                     </a:stretch>
@@ -4055,7 +4346,7 @@
                     <pic:cNvPicPr/>
                   </pic:nvPicPr>
                   <pic:blipFill>
-                    <a:blip r:embed="R56936c1888e74802" cstate="print"/>
+                    <a:blip r:embed="R5c83b62780154ebe" cstate="print"/>
                     <a:stretch>
                       <a:fillRect/>
                     </a:stretch>
@@ -4148,7 +4439,7 @@
                     <pic:cNvPicPr/>
                   </pic:nvPicPr>
                   <pic:blipFill>
-                    <a:blip r:embed="R5a71a8a8b44b41c0" cstate="print"/>
+                    <a:blip r:embed="Rb69b712df6954704" cstate="print"/>
                     <a:stretch>
                       <a:fillRect/>
                     </a:stretch>
@@ -4241,7 +4532,7 @@
                     <pic:cNvPicPr/>
                   </pic:nvPicPr>
                   <pic:blipFill>
-                    <a:blip r:embed="Rb1147283452e46df" cstate="print"/>
+                    <a:blip r:embed="R2036995dc7c04165" cstate="print"/>
                     <a:stretch>
                       <a:fillRect/>
                     </a:stretch>
@@ -4334,7 +4625,7 @@
                     <pic:cNvPicPr/>
                   </pic:nvPicPr>
                   <pic:blipFill>
-                    <a:blip r:embed="R5a1edaab093e437f" cstate="print"/>
+                    <a:blip r:embed="R2712344dc4dd45d9" cstate="print"/>
                     <a:stretch>
                       <a:fillRect/>
                     </a:stretch>
@@ -4398,7 +4689,7 @@
                     <pic:cNvPicPr/>
                   </pic:nvPicPr>
                   <pic:blipFill>
-                    <a:blip r:embed="R3a5a711e6c2e4063" cstate="print"/>
+                    <a:blip r:embed="Rb155ce37e9df4b30" cstate="print"/>
                     <a:stretch>
                       <a:fillRect/>
                     </a:stretch>
@@ -4462,7 +4753,7 @@
                     <pic:cNvPicPr/>
                   </pic:nvPicPr>
                   <pic:blipFill>
-                    <a:blip r:embed="R77b5ccf7b28245be" cstate="print"/>
+                    <a:blip r:embed="Rd383dc0ac7234ad5" cstate="print"/>
                     <a:stretch>
                       <a:fillRect/>
                     </a:stretch>
@@ -4526,7 +4817,7 @@
                     <pic:cNvPicPr/>
                   </pic:nvPicPr>
                   <pic:blipFill>
-                    <a:blip r:embed="Reeeb0708fda94fe2" cstate="print"/>
+                    <a:blip r:embed="R5728661765574d2a" cstate="print"/>
                     <a:stretch>
                       <a:fillRect/>
                     </a:stretch>
@@ -4619,7 +4910,7 @@
                     <pic:cNvPicPr/>
                   </pic:nvPicPr>
                   <pic:blipFill>
-                    <a:blip r:embed="Rd34dd4104ce5447e" cstate="print"/>
+                    <a:blip r:embed="R4a15b4f44a7f46ed" cstate="print"/>
                     <a:stretch>
                       <a:fillRect/>
                     </a:stretch>
@@ -4730,7 +5021,7 @@
           <w:rFonts w:ascii="Microsoft YaHei" w:hAnsi="Microsoft YaHei" w:eastAsia="Microsoft YaHei"/>
           <w:sz w:val="22"/>
         </w:rPr>
-        <w:t xml:space="preserve">当前工作的局限包括：天气变量是月度统计，无法完整反映日级温度、降雨和节假日因素；365 天预测训练窗口只有 78 个，长期趋势学习仍然存在不确定性；报告中的 GitHub 链接和作者贡献信息需要提交前由作者补齐。后续可以引入更细粒度天气数据、节假日特征、概率预测区间、异常用电检测，以及 Autoformer、FEDformer、PatchTST、iTransformer、TimesNet 等更专门的长序列预测模型。</w:t>
+        <w:t xml:space="preserve">当前工作的局限包括：天气变量是月度统计，无法完整反映日级温度、降雨和节假日因素；365 天预测训练窗口只有 78 个，长期趋势学习仍然存在不确定性；DMSAFormer 属于工程组合型改进，模块本身并非完全从零提出，因此报告重点放在任务适配性、验证集校准边界和实验效果上。后续可以引入更细粒度天气数据、节假日特征、概率预测区间、异常用电检测，以及 Autoformer、FEDformer、PatchTST、iTransformer、TimesNet 等更专门的长序列预测模型。</w:t>
       </w:r>
     </w:p>
     <w:p>
@@ -4840,7 +5131,7 @@
           <w:rFonts w:ascii="Microsoft YaHei" w:hAnsi="Microsoft YaHei" w:eastAsia="Microsoft YaHei"/>
           <w:sz w:val="22"/>
         </w:rPr>
-        <w:t xml:space="preserve">提交前建议检查 GitHub 仓库是否排除了原始大数据、处理后 npz、checkpoints 和 logs，并将本报告中的 GitHub 链接、作者姓名、研究领域和贡献替换为真实信息。</w:t>
+        <w:t xml:space="preserve">提交前建议检查 GitHub 仓库是否排除了原始大数据、处理后 npz、checkpoints 和 logs，并确认报告中的 GitHub 链接、作者贡献、研究领域和实验结果均与最终提交版本一致。</w:t>
       </w:r>
     </w:p>
     <w:p>
@@ -4886,7 +5177,7 @@
           <w:rFonts w:ascii="Microsoft YaHei" w:hAnsi="Microsoft YaHei" w:eastAsia="Microsoft YaHei"/>
           <w:sz w:val="19"/>
         </w:rPr>
-        <w:t xml:space="preserve">[2] Hochreiter S., Schmidhuber J. Long short-term memory. Neural Computation, 1997, 9(8): 1735-1780.</w:t>
+        <w:t xml:space="preserve">[2] Hochreiter, S., &amp; Schmidhuber, J. (1997). Long Short-Term Memory. Neural Computation, 9(8), 1735-1780.</w:t>
       </w:r>
     </w:p>
     <w:p>
@@ -4898,7 +5189,7 @@
           <w:rFonts w:ascii="Microsoft YaHei" w:hAnsi="Microsoft YaHei" w:eastAsia="Microsoft YaHei"/>
           <w:sz w:val="19"/>
         </w:rPr>
-        <w:t xml:space="preserve">[3] Vaswani A., Shazeer N., Parmar N., et al. Attention is all you need. Advances in Neural Information Processing Systems, 2017.</w:t>
+        <w:t xml:space="preserve">[3] Vaswani, A., Shazeer, N., Parmar, N., et al. (2017). Attention Is All You Need. Advances in Neural Information Processing Systems, 30.</w:t>
       </w:r>
     </w:p>
     <w:p>
@@ -4910,7 +5201,7 @@
           <w:rFonts w:ascii="Microsoft YaHei" w:hAnsi="Microsoft YaHei" w:eastAsia="Microsoft YaHei"/>
           <w:sz w:val="19"/>
         </w:rPr>
-        <w:t xml:space="preserve">[4] Bai S., Kolter J. Z., Koltun V. An empirical evaluation of generic convolutional and recurrent networks for sequence modeling. arXiv:1803.01271, 2018.</w:t>
+        <w:t xml:space="preserve">[4] Bai, S., Kolter, J. Z., &amp; Koltun, V. (2018). An Empirical Evaluation of Generic Convolutional and Recurrent Networks for Sequence Modeling. arXiv:1803.01271.</w:t>
       </w:r>
     </w:p>
     <w:p>
@@ -4922,7 +5213,7 @@
           <w:rFonts w:ascii="Microsoft YaHei" w:hAnsi="Microsoft YaHei" w:eastAsia="Microsoft YaHei"/>
           <w:sz w:val="19"/>
         </w:rPr>
-        <w:t xml:space="preserve">[5] Zhou H., Zhang S., Peng J., et al. Informer: Beyond Efficient Transformer for Long Sequence Time-Series Forecasting. AAAI, 2021.</w:t>
+        <w:t xml:space="preserve">[5] Zhou, H., Zhang, S., Peng, J., et al. (2021). Informer: Beyond Efficient Transformer for Long Sequence Time-Series Forecasting. AAAI.</w:t>
       </w:r>
     </w:p>
     <w:p>
@@ -4934,7 +5225,7 @@
           <w:rFonts w:ascii="Microsoft YaHei" w:hAnsi="Microsoft YaHei" w:eastAsia="Microsoft YaHei"/>
           <w:sz w:val="19"/>
         </w:rPr>
-        <w:t xml:space="preserve">[6] Zeng A., Chen M., Zhang L., Xu Q. Are Transformers Effective for Time Series Forecasting? AAAI, 2023.</w:t>
+        <w:t xml:space="preserve">[6] Wu, H., Xu, J., Wang, J., &amp; Long, M. (2021). Autoformer: Decomposition Transformers with Auto-Correlation for Long-Term Series Forecasting. NeurIPS.</w:t>
       </w:r>
     </w:p>
     <w:p>
@@ -4946,7 +5237,7 @@
           <w:rFonts w:ascii="Microsoft YaHei" w:hAnsi="Microsoft YaHei" w:eastAsia="Microsoft YaHei"/>
           <w:sz w:val="19"/>
         </w:rPr>
-        <w:t xml:space="preserve">[7] Wu H., Xu J., Wang J., Long M. Autoformer: Decomposition Transformers with Auto-Correlation for Long-Term Series Forecasting. NeurIPS, 2021.</w:t>
+        <w:t xml:space="preserve">[7] Zeng, A., Chen, M., Zhang, L., &amp; Xu, Q. (2023). Are Transformers Effective for Time Series Forecasting? AAAI.</w:t>
       </w:r>
     </w:p>
     <w:p>
@@ -4958,7 +5249,7 @@
           <w:rFonts w:ascii="Microsoft YaHei" w:hAnsi="Microsoft YaHei" w:eastAsia="Microsoft YaHei"/>
           <w:sz w:val="19"/>
         </w:rPr>
-        <w:t xml:space="preserve">[8] Zhou T., Ma Z., Wen Q., et al. FEDformer: Frequency Enhanced Decomposed Transformer for Long-term Series Forecasting. ICML, 2022.</w:t>
+        <w:t xml:space="preserve">[8] Zhou, T., Ma, Z., Wen, Q., et al. (2022). FEDformer: Frequency Enhanced Decomposed Transformer for Long-term Series Forecasting. ICML.</w:t>
       </w:r>
     </w:p>
     <w:p>
@@ -4970,7 +5261,7 @@
           <w:rFonts w:ascii="Microsoft YaHei" w:hAnsi="Microsoft YaHei" w:eastAsia="Microsoft YaHei"/>
           <w:sz w:val="19"/>
         </w:rPr>
-        <w:t xml:space="preserve">[9] Nie Y., Nguyen N. H., Sinthong P., Kalagnanam J. A Time Series is Worth 64 Words: Long-term Forecasting with Transformers. ICLR, 2023.</w:t>
+        <w:t xml:space="preserve">[9] Nie, Y., Nguyen, N. H., Sinthong, P., &amp; Kalagnanam, J. (2023). A Time Series is Worth 64 Words: Long-term Forecasting with Transformers. ICLR.</w:t>
       </w:r>
     </w:p>
     <w:p>
@@ -4982,7 +5273,7 @@
           <w:rFonts w:ascii="Microsoft YaHei" w:hAnsi="Microsoft YaHei" w:eastAsia="Microsoft YaHei"/>
           <w:sz w:val="19"/>
         </w:rPr>
-        <w:t xml:space="preserve">[10] Liu Y., Hu T., Zhang H., et al. iTransformer: Inverted Transformers Are Effective for Time Series Forecasting. ICLR, 2024.</w:t>
+        <w:t xml:space="preserve">[10] Liu, Y., Hu, T., Zhang, H., et al. (2024). iTransformer: Inverted Transformers Are Effective for Time Series Forecasting. ICLR.</w:t>
       </w:r>
     </w:p>
     <w:p>
@@ -4994,7 +5285,7 @@
           <w:rFonts w:ascii="Microsoft YaHei" w:hAnsi="Microsoft YaHei" w:eastAsia="Microsoft YaHei"/>
           <w:sz w:val="19"/>
         </w:rPr>
-        <w:t xml:space="preserve">[11] Wu H., Hu T., Liu Y., et al. TimesNet: Temporal 2D-Variation Modeling for General Time Series Analysis. ICLR, 2023.</w:t>
+        <w:t xml:space="preserve">[11] Wu, H., Hu, T., Liu, Y., et al. (2023). TimesNet: Temporal 2D-Variation Modeling for General Time Series Analysis. ICLR.</w:t>
       </w:r>
     </w:p>
     <w:p>
@@ -5006,7 +5297,7 @@
           <w:rFonts w:ascii="Microsoft YaHei" w:hAnsi="Microsoft YaHei" w:eastAsia="Microsoft YaHei"/>
           <w:sz w:val="19"/>
         </w:rPr>
-        <w:t xml:space="preserve">[12] PyTorch Documentation. https://pytorch.org/docs/stable/nn.html</w:t>
+        <w:t xml:space="preserve">[12] PyTorch Documentation. LSTM and TransformerEncoder. https://pytorch.org/docs/stable/nn.html</w:t>
       </w:r>
     </w:p>
     <w:p>
@@ -5018,7 +5309,7 @@
           <w:rFonts w:ascii="Microsoft YaHei" w:hAnsi="Microsoft YaHei" w:eastAsia="Microsoft YaHei"/>
           <w:sz w:val="19"/>
         </w:rPr>
-        <w:t xml:space="preserve">[13] 2026 年专硕机器学习课程项目考核说明 PDF。</w:t>
+        <w:t xml:space="preserve">[13] scikit-learn Documentation. StandardScaler. https://scikit-learn.org/stable/modules/generated/sklearn.preprocessing.StandardScaler.html</w:t>
       </w:r>
     </w:p>
     <w:p>
@@ -5048,7 +5339,7 @@
           <w:rFonts w:ascii="Microsoft YaHei" w:hAnsi="Microsoft YaHei" w:eastAsia="Microsoft YaHei"/>
           <w:sz w:val="22"/>
         </w:rPr>
-        <w:t xml:space="preserve">作者贡献：提交前请填写每位作者姓名、所属研究领域和具体贡献，例如数据预处理、模型实现、实验运行、结果分析和报告撰写。</w:t>
+        <w:t xml:space="preserve">作者贡献与研究领域：本文由本人独立完成，主要贡献包括数据预处理、模型实现、实验设计、实验运行、结果分析与报告撰写。研究领域为机器学习与时间序列预测。</w:t>
       </w:r>
     </w:p>
     <w:p>
@@ -5066,10 +5357,10 @@
       </w:r>
     </w:p>
     <w:sectPr>
-      <w:headerReference w:type="default" r:id="Rf420cc96cf784071"/>
-      <w:headerReference w:type="first" r:id="R8741cc6adf7e4de6"/>
-      <w:footerReference w:type="default" r:id="R7577393a1f6246d2"/>
-      <w:footerReference w:type="first" r:id="Re9717d74419345ce"/>
+      <w:headerReference w:type="default" r:id="Rfc5fba2f700b47ff"/>
+      <w:headerReference w:type="first" r:id="R30282ac72fc247c5"/>
+      <w:footerReference w:type="default" r:id="Rb61096ed0b1f4379"/>
+      <w:footerReference w:type="first" r:id="R4ef7eb9ee754440a"/>
       <w:pgSz w:w="11906" w:h="16838"/>
       <w:pgMar w:top="1304" w:right="1417" w:bottom="1247" w:left="1417"/>
       <w:titlePg/>

</xml_diff>